<commit_message>
Pustaka paket: Guru penyusun di Ubah keterangan dikunci, mengikuti tombol Atur; panduan diperbarui
Co-Authored-By: Claude Opus 5.5 <noreply@anthropic.com>
</commit_message>
<xml_diff>
--- a/Panduan_Guru_Asesmen_Merdeka.docx
+++ b/Panduan_Guru_Asesmen_Merdeka.docx
@@ -3328,7 +3328,7 @@
                 <w:sz w:val="19"/>
                 <w:szCs w:val="19"/>
               </w:rPr>
-              <w:t xml:space="preserve">Nama penyusun (untuk mencari dan mengelompokkan paket).</w:t>
+              <w:t xml:space="preserve">Boleh dikosongkan. Begitu paket punya penyusun (guru yang mengunggah dengan PIN pribadinya, atau yang ditetapkan operator), isian ini otomatis diganti nama guru tersebut.</w:t>
             </w:r>
           </w:p>
         </w:tc>
@@ -7437,7 +7437,7 @@
                 <w:sz w:val="19"/>
                 <w:szCs w:val="19"/>
               </w:rPr>
-              <w:t xml:space="preserve">Judul, mata pelajaran (dari daftar Data Induk), jenis, semester, penyusun, tingkat peserta, cakupan materi. Kode tidak bisa diubah.</w:t>
+              <w:t xml:space="preserve">Judul, mata pelajaran (dari daftar Data Induk), jenis, semester, tingkat peserta, cakupan materi. Guru penyusun tampil tetapi tidak bisa diketik: ia mengikuti penyusun paket (lihat 3.6). Kode tidak bisa diubah.</w:t>
             </w:r>
           </w:p>
         </w:tc>
@@ -8080,6 +8080,119 @@
       <w:r>
         <w:t xml:space="preserve">. Pilihan *— tanpa penyusun —* membuat paket boleh dikelola semua guru.</w:t>
       </w:r>
+    </w:p>
+    <w:tbl>
+      <w:tblPr>
+        <w:tblW w:type="dxa" w:w="9638"/>
+        <w:tblBorders>
+          <w:top w:val="none" w:color="FFFFFF" w:sz="0"/>
+          <w:left w:val="single" w:color="2F7FD8" w:sz="30"/>
+          <w:bottom w:val="none" w:color="FFFFFF" w:sz="0"/>
+          <w:right w:val="none" w:color="FFFFFF" w:sz="0"/>
+          <w:insideH w:val="none" w:color="FFFFFF" w:sz="0"/>
+          <w:insideV w:val="none" w:color="FFFFFF" w:sz="0"/>
+        </w:tblBorders>
+      </w:tblPr>
+      <w:tblGrid>
+        <w:gridCol w:w="9638"/>
+      </w:tblGrid>
+      <w:tr>
+        <w:trPr>
+          <w:cantSplit/>
+        </w:trPr>
+        <w:tc>
+          <w:tcPr>
+            <w:tcW w:type="dxa" w:w="9638"/>
+            <w:shd w:fill="E8F1FC" w:color="auto" w:val="clear"/>
+            <w:tcMar>
+              <w:top w:type="dxa" w:w="120"/>
+              <w:left w:type="dxa" w:w="200"/>
+              <w:bottom w:type="dxa" w:w="120"/>
+              <w:right w:type="dxa" w:w="160"/>
+            </w:tcMar>
+          </w:tcPr>
+          <w:p>
+            <w:pPr>
+              <w:spacing w:after="40"/>
+            </w:pPr>
+            <w:r>
+              <w:rPr>
+                <w:b/>
+                <w:bCs/>
+                <w:color w:val="2F7FD8"/>
+                <w:sz w:val="20"/>
+                <w:szCs w:val="20"/>
+              </w:rPr>
+              <w:t xml:space="preserve">Keterangan Guru penyusun mengikuti Atur</w:t>
+            </w:r>
+          </w:p>
+          <w:p>
+            <w:pPr>
+              <w:spacing w:after="40"/>
+            </w:pPr>
+            <w:r>
+              <w:rPr>
+                <w:sz w:val="19"/>
+                <w:szCs w:val="19"/>
+              </w:rPr>
+              <w:t xml:space="preserve">Teks </w:t>
+            </w:r>
+            <w:r>
+              <w:rPr>
+                <w:b/>
+                <w:bCs/>
+                <w:sz w:val="19"/>
+                <w:szCs w:val="19"/>
+              </w:rPr>
+              <w:t xml:space="preserve">Guru penyusun</w:t>
+            </w:r>
+            <w:r>
+              <w:rPr>
+                <w:sz w:val="19"/>
+                <w:szCs w:val="19"/>
+              </w:rPr>
+              <w:t xml:space="preserve"> pada keterangan paket dan kisi-kisi selalu sama dengan penyusun yang dipilih di </w:t>
+            </w:r>
+            <w:r>
+              <w:rPr>
+                <w:b/>
+                <w:bCs/>
+                <w:sz w:val="19"/>
+                <w:szCs w:val="19"/>
+              </w:rPr>
+              <w:t xml:space="preserve">Atur</w:t>
+            </w:r>
+            <w:r>
+              <w:rPr>
+                <w:sz w:val="19"/>
+                <w:szCs w:val="19"/>
+              </w:rPr>
+              <w:t xml:space="preserve">. Mengganti penyusun otomatis mengganti teks itu; isian di </w:t>
+            </w:r>
+            <w:r>
+              <w:rPr>
+                <w:b/>
+                <w:bCs/>
+                <w:sz w:val="19"/>
+                <w:szCs w:val="19"/>
+              </w:rPr>
+              <w:t xml:space="preserve">Ubah judul &amp; keterangan</w:t>
+            </w:r>
+            <w:r>
+              <w:rPr>
+                <w:sz w:val="19"/>
+                <w:szCs w:val="19"/>
+              </w:rPr>
+              <w:t xml:space="preserve"> tidak bisa diketik.</w:t>
+            </w:r>
+          </w:p>
+        </w:tc>
+      </w:tr>
+    </w:tbl>
+    <w:p>
+      <w:pPr>
+        <w:spacing w:after="120"/>
+      </w:pPr>
     </w:p>
     <w:p>
       <w:pPr>

</xml_diff>

<commit_message>
Panduan & Keluar di pojok kanan atas halaman guru; teks Publish sesuai mapel diampu; panduan diperbarui
Co-Authored-By: Claude Opus 5.5 <noreply@anthropic.com>
</commit_message>
<xml_diff>
--- a/Panduan_Guru_Asesmen_Merdeka.docx
+++ b/Panduan_Guru_Asesmen_Merdeka.docx
@@ -958,7 +958,7 @@
         <w:t xml:space="preserve">Publish</w:t>
       </w:r>
       <w:r>
-        <w:t xml:space="preserve"> di Pustaka Paket.</w:t>
+        <w:t xml:space="preserve"> di Pustaka Paket. Sesudah Publish, paket terlihat oleh guru yang mengampu mapel paket itu.</w:t>
       </w:r>
     </w:p>
     <w:p>
@@ -1160,6 +1160,26 @@
       </w:r>
       <w:r>
         <w:t xml:space="preserve">. PIN cukup dimasukkan sekali: berlaku selama peramban terbuka, juga di halaman Upload Soal, Pustaka Paket, dan Admin. Tombol </w:t>
+      </w:r>
+      <w:r>
+        <w:rPr>
+          <w:b/>
+          <w:bCs/>
+        </w:rPr>
+        <w:t xml:space="preserve">📘 Panduan</w:t>
+      </w:r>
+      <w:r>
+        <w:t xml:space="preserve"> dan </w:t>
+      </w:r>
+      <w:r>
+        <w:rPr>
+          <w:b/>
+          <w:bCs/>
+        </w:rPr>
+        <w:t xml:space="preserve">Keluar</w:t>
+      </w:r>
+      <w:r>
+        <w:t xml:space="preserve"> ada di pojok kanan atas setiap halaman guru (tidak tampil di halaman siswa); </w:t>
       </w:r>
       <w:r>
         <w:rPr>
@@ -2764,7 +2784,23 @@
                 <w:sz w:val="19"/>
                 <w:szCs w:val="19"/>
               </w:rPr>
-              <w:t xml:space="preserve">Tanda dari penyusun bahwa paketnya boleh dilihat dan dipakai guru lain. Paket yang </w:t>
+              <w:t xml:space="preserve">Tanda dari penyusun bahwa paketnya boleh dilihat dan dipakai guru lain yang </w:t>
+            </w:r>
+            <w:r>
+              <w:rPr>
+                <w:b/>
+                <w:bCs/>
+                <w:sz w:val="19"/>
+                <w:szCs w:val="19"/>
+              </w:rPr>
+              <w:t xml:space="preserve">mengampu mapel paket itu</w:t>
+            </w:r>
+            <w:r>
+              <w:rPr>
+                <w:sz w:val="19"/>
+                <w:szCs w:val="19"/>
+              </w:rPr>
+              <w:t xml:space="preserve"> (menurut jadwal KBM Data Induk). Paket yang </w:t>
             </w:r>
             <w:r>
               <w:rPr>
@@ -5975,7 +6011,7 @@
                 <w:sz w:val="19"/>
                 <w:szCs w:val="19"/>
               </w:rPr>
-              <w:t xml:space="preserve"> penyusunnya · paket tanpa penyusun (paket lama/dibuat operator) · paket yang pernah Anda pakai untuk membuka sesi.</w:t>
+              <w:t xml:space="preserve"> penyusunnya untuk mapel yang Anda ampu · paket tanpa penyusun (paket lama/dibuat operator) · paket yang pernah Anda pakai untuk membuka sesi.</w:t>
             </w:r>
           </w:p>
         </w:tc>
@@ -7653,10 +7689,10 @@
           <w:b/>
           <w:bCs/>
         </w:rPr>
-        <w:t xml:space="preserve">Publish · terlihat oleh semua guru</w:t>
-      </w:r>
-      <w:r>
-        <w:t xml:space="preserve">.</w:t>
+        <w:t xml:space="preserve">Publish · terlihat oleh guru yang mengampu</w:t>
+      </w:r>
+      <w:r>
+        <w:t xml:space="preserve"> mapel paket itu.</w:t>
       </w:r>
     </w:p>
     <w:tbl>
@@ -7838,7 +7874,7 @@
                 <w:sz w:val="19"/>
                 <w:szCs w:val="19"/>
               </w:rPr>
-              <w:t xml:space="preserve">Semua guru melihat paket, boleh mencoba soal dan membuka sesi untuk kelasnya. Kunci jawaban dan pengelolaan paket tetap hanya untuk penyusun dan operator.</w:t>
+              <w:t xml:space="preserve">Guru yang mengampu mapel paket itu melihat paket, boleh mencoba soal dan membuka sesi untuk kelasnya. Kunci jawaban dan pengelolaan paket tetap hanya untuk penyusun dan operator.</w:t>
             </w:r>
           </w:p>
         </w:tc>
@@ -7970,6 +8006,87 @@
                 <w:szCs w:val="19"/>
               </w:rPr>
               <w:t xml:space="preserve">Paket lama atau buatan operator/PIN bersama: *Terlihat oleh semua guru*. Tidak ada tombol Publish. Bila operator menetapkan penyusunnya, paket langsung berstatus Publish dan penyusun boleh meng-Unpublish.</w:t>
+            </w:r>
+          </w:p>
+        </w:tc>
+      </w:tr>
+    </w:tbl>
+    <w:p>
+      <w:pPr>
+        <w:spacing w:after="120"/>
+      </w:pPr>
+    </w:p>
+    <w:tbl>
+      <w:tblPr>
+        <w:tblW w:type="dxa" w:w="9638"/>
+        <w:tblBorders>
+          <w:top w:val="none" w:color="FFFFFF" w:sz="0"/>
+          <w:left w:val="single" w:color="2F7FD8" w:sz="30"/>
+          <w:bottom w:val="none" w:color="FFFFFF" w:sz="0"/>
+          <w:right w:val="none" w:color="FFFFFF" w:sz="0"/>
+          <w:insideH w:val="none" w:color="FFFFFF" w:sz="0"/>
+          <w:insideV w:val="none" w:color="FFFFFF" w:sz="0"/>
+        </w:tblBorders>
+      </w:tblPr>
+      <w:tblGrid>
+        <w:gridCol w:w="9638"/>
+      </w:tblGrid>
+      <w:tr>
+        <w:trPr>
+          <w:cantSplit/>
+        </w:trPr>
+        <w:tc>
+          <w:tcPr>
+            <w:tcW w:type="dxa" w:w="9638"/>
+            <w:shd w:fill="E8F1FC" w:color="auto" w:val="clear"/>
+            <w:tcMar>
+              <w:top w:type="dxa" w:w="120"/>
+              <w:left w:type="dxa" w:w="200"/>
+              <w:bottom w:type="dxa" w:w="120"/>
+              <w:right w:type="dxa" w:w="160"/>
+            </w:tcMar>
+          </w:tcPr>
+          <w:p>
+            <w:pPr>
+              <w:spacing w:after="40"/>
+            </w:pPr>
+            <w:r>
+              <w:rPr>
+                <w:b/>
+                <w:bCs/>
+                <w:color w:val="2F7FD8"/>
+                <w:sz w:val="20"/>
+                <w:szCs w:val="20"/>
+              </w:rPr>
+              <w:t xml:space="preserve">Siapa yang mengampu mapel</w:t>
+            </w:r>
+          </w:p>
+          <w:p>
+            <w:pPr>
+              <w:spacing w:after="40"/>
+            </w:pPr>
+            <w:r>
+              <w:rPr>
+                <w:sz w:val="19"/>
+                <w:szCs w:val="19"/>
+              </w:rPr>
+              <w:t xml:space="preserve">Diambil dari </w:t>
+            </w:r>
+            <w:r>
+              <w:rPr>
+                <w:b/>
+                <w:bCs/>
+                <w:sz w:val="19"/>
+                <w:szCs w:val="19"/>
+              </w:rPr>
+              <w:t xml:space="preserve">jadwal KBM</w:t>
+            </w:r>
+            <w:r>
+              <w:rPr>
+                <w:sz w:val="19"/>
+                <w:szCs w:val="19"/>
+              </w:rPr>
+              <w:t xml:space="preserve"> periode terbaru di Data Induk, ditambah mapel utama guru. Mapel TL disamakan dengan mapel induknya (Matematika TL = Matematika). Guru yang belum punya mapel di jadwal tetap melihat semua paket yang di-Publish. Operator dan pengawas selalu melihat semua paket.</w:t>
             </w:r>
           </w:p>
         </w:tc>
@@ -14236,7 +14353,7 @@
                 <w:sz w:val="19"/>
                 <w:szCs w:val="19"/>
               </w:rPr>
-              <w:t xml:space="preserve">. Buka Pustaka Paket → rincian paket → </w:t>
+              <w:t xml:space="preserve"> (buka Pustaka Paket → rincian paket → </w:t>
             </w:r>
             <w:r>
               <w:rPr>
@@ -14252,7 +14369,7 @@
                 <w:sz w:val="19"/>
                 <w:szCs w:val="19"/>
               </w:rPr>
-              <w:t xml:space="preserve">.</w:t>
+              <w:t xml:space="preserve">), atau guru itu tidak mengampu mapel paket tersebut di jadwal KBM Data Induk.</w:t>
             </w:r>
           </w:p>
         </w:tc>

</xml_diff>

<commit_message>
Pustaka paket: Jenis jadi droplist tetap dari sistem, bawaan Latihan Harian
Co-Authored-By: Claude Opus 5.5 <noreply@anthropic.com>
</commit_message>
<xml_diff>
--- a/Panduan_Guru_Asesmen_Merdeka.docx
+++ b/Panduan_Guru_Asesmen_Merdeka.docx
@@ -3148,7 +3148,23 @@
                 <w:sz w:val="19"/>
                 <w:szCs w:val="19"/>
               </w:rPr>
-              <w:t xml:space="preserve">Latihan / Ulangan Harian / Tengah Semester / Akhir Semester / Tryout TKA / Tryout UTBK. Singkatan UH, PTS, PAS, SAS, TKA, UTBK, SNBT dikenali.</w:t>
+              <w:t xml:space="preserve">Pilih salah satu: Latihan Harian / Asesmen Formatif / Asesmen Sumatif / Tryout TKA / Tryout UTBK. Kosong atau tidak dikenali = </w:t>
+            </w:r>
+            <w:r>
+              <w:rPr>
+                <w:b/>
+                <w:bCs/>
+                <w:sz w:val="19"/>
+                <w:szCs w:val="19"/>
+              </w:rPr>
+              <w:t xml:space="preserve">Latihan Harian</w:t>
+            </w:r>
+            <w:r>
+              <w:rPr>
+                <w:sz w:val="19"/>
+                <w:szCs w:val="19"/>
+              </w:rPr>
+              <w:t xml:space="preserve">. Ulangan harian, PTS, PAS, SAS dibaca sebagai Asesmen Sumatif; TKA, UTBK, SNBT dikenali. Daftar jenis ditentukan sistem dan hanya bertambah bila operator membuat asesmen baru di PAS / Ujian Bersama (paket naskah PAS otomatis berjenis nama asesmen itu).</w:t>
             </w:r>
           </w:p>
         </w:tc>
@@ -7473,7 +7489,7 @@
                 <w:sz w:val="19"/>
                 <w:szCs w:val="19"/>
               </w:rPr>
-              <w:t xml:space="preserve">Judul, mata pelajaran (dari daftar Data Induk), jenis, semester, tingkat peserta, cakupan materi. Guru penyusun tampil tetapi tidak bisa diketik: ia mengikuti penyusun paket (lihat 3.6). Kode tidak bisa diubah.</w:t>
+              <w:t xml:space="preserve">Judul, mata pelajaran (dari daftar Data Induk), jenis (droplist tetap dari sistem), semester, tingkat peserta, cakupan materi. Guru penyusun tampil tetapi tidak bisa diketik: ia mengikuti penyusun paket (lihat 3.6). Kode tidak bisa diubah.</w:t>
             </w:r>
           </w:p>
         </w:tc>

</xml_diff>

<commit_message>
Struktur menu baru: Latihan/Tryout (dengan/tanpa kode, terjadwal), Pustaka + Upload, NISN Siswa per kelas, Asesmen Bersama & Kontrol Pelaksanaan; panduan diperbarui
Co-Authored-By: Claude Opus 5.5 <noreply@anthropic.com>
</commit_message>
<xml_diff>
--- a/Panduan_Guru_Asesmen_Merdeka.docx
+++ b/Panduan_Guru_Asesmen_Merdeka.docx
@@ -45,7 +45,7 @@
           <w:sz w:val="30"/>
           <w:szCs w:val="30"/>
         </w:rPr>
-        <w:t xml:space="preserve">Menyusun paket soal, membuka sesi ujian, dan membaca hasil</w:t>
+        <w:t xml:space="preserve">Menyusun paket soal, membuka latihan/tryout, dan membaca hasil</w:t>
       </w:r>
     </w:p>
     <w:p>
@@ -121,7 +121,7 @@
           <w:b/>
           <w:bCs/>
         </w:rPr>
-        <w:t xml:space="preserve">Sesi Ujian</w:t>
+        <w:t xml:space="preserve">Latihan / Tryout</w:t>
       </w:r>
     </w:p>
     <w:p>
@@ -267,7 +267,7 @@
           <w:bCs w:val="false"/>
           <w:color w:val="33445A"/>
         </w:rPr>
-        <w:t xml:space="preserve">1.3 Menu guru</w:t>
+        <w:t xml:space="preserve">1.3 Menu</w:t>
       </w:r>
     </w:p>
     <w:p>
@@ -379,7 +379,7 @@
           <w:bCs w:val="false"/>
           <w:color w:val="33445A"/>
         </w:rPr>
-        <w:t xml:space="preserve">2.6 Jalur darurat</w:t>
+        <w:t xml:space="preserve">2.6 Upload tanpa kisi-kisi</w:t>
       </w:r>
     </w:p>
     <w:p>
@@ -491,7 +491,7 @@
           <w:bCs/>
           <w:color w:val="1F2633"/>
         </w:rPr>
-        <w:t xml:space="preserve">4. Sesi Ujian</w:t>
+        <w:t xml:space="preserve">4. Latihan / Tryout</w:t>
       </w:r>
     </w:p>
     <w:p>
@@ -505,7 +505,7 @@
           <w:bCs w:val="false"/>
           <w:color w:val="33445A"/>
         </w:rPr>
-        <w:t xml:space="preserve">4.1 Membuka sesi baru</w:t>
+        <w:t xml:space="preserve">4.1 Membuka latihan / tryout</w:t>
       </w:r>
     </w:p>
     <w:p>
@@ -729,7 +729,7 @@
           <w:bCs w:val="false"/>
           <w:color w:val="33445A"/>
         </w:rPr>
-        <w:t xml:space="preserve">5.10 Daftar Siswa</w:t>
+        <w:t xml:space="preserve">5.10 NISN Siswa</w:t>
       </w:r>
     </w:p>
     <w:p>
@@ -875,7 +875,7 @@
           <w:b/>
           <w:bCs/>
         </w:rPr>
-        <w:t xml:space="preserve">Upload Soal → Langkah 1</w:t>
+        <w:t xml:space="preserve">Pustaka Paket → + Upload soal → Langkah 1</w:t>
       </w:r>
       <w:r>
         <w:t xml:space="preserve">. Aplikasi membuatkan </w:t>
@@ -975,7 +975,7 @@
           <w:b/>
           <w:bCs/>
         </w:rPr>
-        <w:t xml:space="preserve">Sesi ujian</w:t>
+        <w:t xml:space="preserve">Latihan / Tryout</w:t>
       </w:r>
       <w:r>
         <w:t xml:space="preserve"> — di </w:t>
@@ -985,20 +985,30 @@
           <w:b/>
           <w:bCs/>
         </w:rPr>
-        <w:t xml:space="preserve">Menu guru → Sesi Ujian</w:t>
-      </w:r>
-      <w:r>
-        <w:t xml:space="preserve">, pilih paket dan kelas peserta. Server memberi </w:t>
+        <w:t xml:space="preserve">Menu guru → Latihan / Tryout</w:t>
+      </w:r>
+      <w:r>
+        <w:t xml:space="preserve">, pilih paket dan kelas peserta, </w:t>
       </w:r>
       <w:r>
         <w:rPr>
           <w:b/>
           <w:bCs/>
         </w:rPr>
-        <w:t xml:space="preserve">kode akses 6 angka</w:t>
-      </w:r>
-      <w:r>
-        <w:t xml:space="preserve">.</w:t>
+        <w:t xml:space="preserve">dengan kode akses</w:t>
+      </w:r>
+      <w:r>
+        <w:t xml:space="preserve"> (server memberi kode 6 angka) atau </w:t>
+      </w:r>
+      <w:r>
+        <w:rPr>
+          <w:b/>
+          <w:bCs/>
+        </w:rPr>
+        <w:t xml:space="preserve">tanpa kode akses</w:t>
+      </w:r>
+      <w:r>
+        <w:t xml:space="preserve"> (cukup NISN), mulai sekarang atau terjadwal.</w:t>
       </w:r>
     </w:p>
     <w:p>
@@ -1018,7 +1028,7 @@
         <w:t xml:space="preserve">Siswa mengerjakan</w:t>
       </w:r>
       <w:r>
-        <w:t xml:space="preserve"> di HP: buka halaman siswa, ketik NISN + kode akses. Jawaban tersimpan otomatis.</w:t>
+        <w:t xml:space="preserve"> di HP: buka halaman siswa, ketik NISN (+ kode akses bila ada). Jawaban tersimpan otomatis.</w:t>
       </w:r>
     </w:p>
     <w:p>
@@ -1105,7 +1115,7 @@
                 <w:sz w:val="19"/>
                 <w:szCs w:val="19"/>
               </w:rPr>
-              <w:t xml:space="preserve">Siswa selalu membuka alamat halaman siswa yang sama. Kode akses sesi sekaligus menentukan ujian mana yang dikerjakan, jadi guru tidak perlu membagikan tautan per ujian.</w:t>
+              <w:t xml:space="preserve">Siswa selalu membuka alamat halaman siswa yang sama. Kode akses sesi sekaligus menentukan ujian mana yang dikerjakan; pada sesi tanpa kode akses, ujiannya ditentukan dari kelas siswa dan jam sesi. Guru tidak perlu membagikan tautan per ujian.</w:t>
             </w:r>
           </w:p>
         </w:tc>
@@ -1159,7 +1169,7 @@
         <w:t xml:space="preserve">Masuk</w:t>
       </w:r>
       <w:r>
-        <w:t xml:space="preserve">. PIN cukup dimasukkan sekali: berlaku selama peramban terbuka, juga di halaman Upload Soal, Pustaka Paket, dan Admin. Tombol </w:t>
+        <w:t xml:space="preserve">. PIN cukup dimasukkan sekali: berlaku selama peramban terbuka, juga di halaman Pustaka Paket, Asesmen Bersama, Kontrol Pelaksanaan, dan Admin. Tombol </w:t>
       </w:r>
       <w:r>
         <w:rPr>
@@ -1351,7 +1361,7 @@
                 <w:sz w:val="19"/>
                 <w:szCs w:val="19"/>
               </w:rPr>
-              <w:t xml:space="preserve">Guru · kelola</w:t>
+              <w:t xml:space="preserve">Guru</w:t>
             </w:r>
           </w:p>
         </w:tc>
@@ -1374,7 +1384,71 @@
                 <w:sz w:val="19"/>
                 <w:szCs w:val="19"/>
               </w:rPr>
-              <w:t xml:space="preserve">Mengunggah paket (tercatat atas nama Anda), mengelola paket buatan sendiri, membuka/mengatur/menutup sesi miliknya, saklar pembahasan, reset hasil, dasbor, daftar siswa (lihat saja).</w:t>
+              <w:t xml:space="preserve">Menu </w:t>
+            </w:r>
+            <w:r>
+              <w:rPr>
+                <w:b/>
+                <w:bCs/>
+                <w:sz w:val="19"/>
+                <w:szCs w:val="19"/>
+              </w:rPr>
+              <w:t xml:space="preserve">Latihan / Tryout</w:t>
+            </w:r>
+            <w:r>
+              <w:rPr>
+                <w:sz w:val="19"/>
+                <w:szCs w:val="19"/>
+              </w:rPr>
+              <w:t xml:space="preserve">, </w:t>
+            </w:r>
+            <w:r>
+              <w:rPr>
+                <w:b/>
+                <w:bCs/>
+                <w:sz w:val="19"/>
+                <w:szCs w:val="19"/>
+              </w:rPr>
+              <w:t xml:space="preserve">Dasbor Hasil</w:t>
+            </w:r>
+            <w:r>
+              <w:rPr>
+                <w:sz w:val="19"/>
+                <w:szCs w:val="19"/>
+              </w:rPr>
+              <w:t xml:space="preserve">, </w:t>
+            </w:r>
+            <w:r>
+              <w:rPr>
+                <w:b/>
+                <w:bCs/>
+                <w:sz w:val="19"/>
+                <w:szCs w:val="19"/>
+              </w:rPr>
+              <w:t xml:space="preserve">Pustaka Paket</w:t>
+            </w:r>
+            <w:r>
+              <w:rPr>
+                <w:sz w:val="19"/>
+                <w:szCs w:val="19"/>
+              </w:rPr>
+              <w:t xml:space="preserve"> (termasuk upload soal), </w:t>
+            </w:r>
+            <w:r>
+              <w:rPr>
+                <w:b/>
+                <w:bCs/>
+                <w:sz w:val="19"/>
+                <w:szCs w:val="19"/>
+              </w:rPr>
+              <w:t xml:space="preserve">NISN Siswa</w:t>
+            </w:r>
+            <w:r>
+              <w:rPr>
+                <w:sz w:val="19"/>
+                <w:szCs w:val="19"/>
+              </w:rPr>
+              <w:t xml:space="preserve"> (kelas yang Anda ampu). Paket yang diunggah tercatat atas nama Anda.</w:t>
             </w:r>
           </w:p>
         </w:tc>
@@ -1429,7 +1503,7 @@
                 <w:sz w:val="19"/>
                 <w:szCs w:val="19"/>
               </w:rPr>
-              <w:t xml:space="preserve">Pengawas · lihat</w:t>
+              <w:t xml:space="preserve">Pengawas</w:t>
             </w:r>
           </w:p>
         </w:tc>
@@ -1453,23 +1527,39 @@
                 <w:sz w:val="19"/>
                 <w:szCs w:val="19"/>
               </w:rPr>
-              <w:t xml:space="preserve">Melihat sesi dan dasbor, memantau siswa, </w:t>
-            </w:r>
-            <w:r>
-              <w:rPr>
-                <w:b/>
-                <w:bCs/>
-                <w:sz w:val="19"/>
-                <w:szCs w:val="19"/>
-              </w:rPr>
-              <w:t xml:space="preserve">Lepas</w:t>
-            </w:r>
-            <w:r>
-              <w:rPr>
-                <w:sz w:val="19"/>
-                <w:szCs w:val="19"/>
-              </w:rPr>
-              <w:t xml:space="preserve"> siswa, membuka kunci di HP siswa, daftar siswa. Tidak bisa membuka sesi, mengubah, atau menghapus.</w:t>
+              <w:t xml:space="preserve">Menu </w:t>
+            </w:r>
+            <w:r>
+              <w:rPr>
+                <w:b/>
+                <w:bCs/>
+                <w:sz w:val="19"/>
+                <w:szCs w:val="19"/>
+              </w:rPr>
+              <w:t xml:space="preserve">Kontrol Pelaksanaan</w:t>
+            </w:r>
+            <w:r>
+              <w:rPr>
+                <w:sz w:val="19"/>
+                <w:szCs w:val="19"/>
+              </w:rPr>
+              <w:t xml:space="preserve"> (layar ruang Asesmen Bersama) dan </w:t>
+            </w:r>
+            <w:r>
+              <w:rPr>
+                <w:b/>
+                <w:bCs/>
+                <w:sz w:val="19"/>
+                <w:szCs w:val="19"/>
+              </w:rPr>
+              <w:t xml:space="preserve">NISN Siswa</w:t>
+            </w:r>
+            <w:r>
+              <w:rPr>
+                <w:sz w:val="19"/>
+                <w:szCs w:val="19"/>
+              </w:rPr>
+              <w:t xml:space="preserve"> (semua kelas).</w:t>
             </w:r>
           </w:p>
         </w:tc>
@@ -1522,7 +1612,7 @@
                 <w:sz w:val="19"/>
                 <w:szCs w:val="19"/>
               </w:rPr>
-              <w:t xml:space="preserve">Operator · akses penuh</w:t>
+              <w:t xml:space="preserve">Admin · operator</w:t>
             </w:r>
           </w:p>
         </w:tc>
@@ -1545,7 +1635,71 @@
                 <w:sz w:val="19"/>
                 <w:szCs w:val="19"/>
               </w:rPr>
-              <w:t xml:space="preserve">Semuanya, termasuk data siswa, PIN guru, penyusun paket, semua sesi, cadangan, dan arsip semester.</w:t>
+              <w:t xml:space="preserve">Menu </w:t>
+            </w:r>
+            <w:r>
+              <w:rPr>
+                <w:b/>
+                <w:bCs/>
+                <w:sz w:val="19"/>
+                <w:szCs w:val="19"/>
+              </w:rPr>
+              <w:t xml:space="preserve">Asesmen Bersama</w:t>
+            </w:r>
+            <w:r>
+              <w:rPr>
+                <w:sz w:val="19"/>
+                <w:szCs w:val="19"/>
+              </w:rPr>
+              <w:t xml:space="preserve">, </w:t>
+            </w:r>
+            <w:r>
+              <w:rPr>
+                <w:b/>
+                <w:bCs/>
+                <w:sz w:val="19"/>
+                <w:szCs w:val="19"/>
+              </w:rPr>
+              <w:t xml:space="preserve">Kontrol Pelaksanaan</w:t>
+            </w:r>
+            <w:r>
+              <w:rPr>
+                <w:sz w:val="19"/>
+                <w:szCs w:val="19"/>
+              </w:rPr>
+              <w:t xml:space="preserve">, </w:t>
+            </w:r>
+            <w:r>
+              <w:rPr>
+                <w:b/>
+                <w:bCs/>
+                <w:sz w:val="19"/>
+                <w:szCs w:val="19"/>
+              </w:rPr>
+              <w:t xml:space="preserve">Dasbor Hasil</w:t>
+            </w:r>
+            <w:r>
+              <w:rPr>
+                <w:sz w:val="19"/>
+                <w:szCs w:val="19"/>
+              </w:rPr>
+              <w:t xml:space="preserve">, </w:t>
+            </w:r>
+            <w:r>
+              <w:rPr>
+                <w:b/>
+                <w:bCs/>
+                <w:sz w:val="19"/>
+                <w:szCs w:val="19"/>
+              </w:rPr>
+              <w:t xml:space="preserve">Admin</w:t>
+            </w:r>
+            <w:r>
+              <w:rPr>
+                <w:sz w:val="19"/>
+                <w:szCs w:val="19"/>
+              </w:rPr>
+              <w:t xml:space="preserve"> (data siswa, PIN guru, pustaka paket semua guru, cadangan, arsip semester).</w:t>
             </w:r>
           </w:p>
         </w:tc>
@@ -1638,7 +1792,15 @@
         <w:pStyle w:val="Heading2"/>
       </w:pPr>
       <w:r>
-        <w:t xml:space="preserve">1.3 Menu guru</w:t>
+        <w:t xml:space="preserve">1.3 Menu</w:t>
+      </w:r>
+    </w:p>
+    <w:p>
+      <w:pPr>
+        <w:spacing w:after="120"/>
+      </w:pPr>
+      <w:r>
+        <w:t xml:space="preserve">Ubin menu menyesuaikan PIN yang dipakai (struktur menu sejak 21 Oktober 2026).</w:t>
       </w:r>
     </w:p>
     <w:tbl>
@@ -1770,7 +1932,7 @@
                 <w:sz w:val="19"/>
                 <w:szCs w:val="19"/>
               </w:rPr>
-              <w:t xml:space="preserve">Sesi Ujian</w:t>
+              <w:t xml:space="preserve">Latihan / Tryout</w:t>
             </w:r>
           </w:p>
         </w:tc>
@@ -1793,7 +1955,7 @@
                 <w:sz w:val="19"/>
                 <w:szCs w:val="19"/>
               </w:rPr>
-              <w:t xml:space="preserve">Buka sesi untuk kelas, tampilkan kode akses, pantau siswa, tambah/kurangi waktu, pembahasan.</w:t>
+              <w:t xml:space="preserve">Buka latihan/tryout untuk kelas: dengan atau tanpa kode akses, sekarang atau terjadwal; tampilkan kode, pantau siswa, tambah/kurangi waktu, pembahasan.</w:t>
             </w:r>
           </w:p>
         </w:tc>
@@ -1816,7 +1978,7 @@
                 <w:sz w:val="19"/>
                 <w:szCs w:val="19"/>
               </w:rPr>
-              <w:t xml:space="preserve">semua (pengawas: lihat &amp; bantu)</w:t>
+              <w:t xml:space="preserve">guru</w:t>
             </w:r>
           </w:p>
         </w:tc>
@@ -1895,7 +2057,7 @@
                 <w:sz w:val="19"/>
                 <w:szCs w:val="19"/>
               </w:rPr>
-              <w:t xml:space="preserve">semua</w:t>
+              <w:t xml:space="preserve">guru, operator</w:t>
             </w:r>
           </w:p>
         </w:tc>
@@ -1925,7 +2087,7 @@
                 <w:sz w:val="19"/>
                 <w:szCs w:val="19"/>
               </w:rPr>
-              <w:t xml:space="preserve">Upload Soal</w:t>
+              <w:t xml:space="preserve">Pustaka Paket</w:t>
             </w:r>
           </w:p>
         </w:tc>
@@ -1948,7 +2110,23 @@
                 <w:sz w:val="19"/>
                 <w:szCs w:val="19"/>
               </w:rPr>
-              <w:t xml:space="preserve">Langkah 1 · Kisi-kisi, Langkah 2 · Soal, Jalur Darurat.</w:t>
+              <w:t xml:space="preserve">Bank soal per jenis: paket Anda dan paket teman semapel yang sudah Publish. Tombol </w:t>
+            </w:r>
+            <w:r>
+              <w:rPr>
+                <w:b/>
+                <w:bCs/>
+                <w:sz w:val="19"/>
+                <w:szCs w:val="19"/>
+              </w:rPr>
+              <w:t xml:space="preserve">+ Upload soal</w:t>
+            </w:r>
+            <w:r>
+              <w:rPr>
+                <w:sz w:val="19"/>
+                <w:szCs w:val="19"/>
+              </w:rPr>
+              <w:t xml:space="preserve">: Langkah 1 · Kisi-kisi, Langkah 2 · Soal, atau Tanpa Kisi-kisi.</w:t>
             </w:r>
           </w:p>
         </w:tc>
@@ -1971,7 +2149,7 @@
                 <w:sz w:val="19"/>
                 <w:szCs w:val="19"/>
               </w:rPr>
-              <w:t xml:space="preserve">guru, operator</w:t>
+              <w:t xml:space="preserve">guru (operator lewat Admin)</w:t>
             </w:r>
           </w:p>
         </w:tc>
@@ -2002,7 +2180,7 @@
                 <w:sz w:val="19"/>
                 <w:szCs w:val="19"/>
               </w:rPr>
-              <w:t xml:space="preserve">Pustaka Paket</w:t>
+              <w:t xml:space="preserve">NISN Siswa</w:t>
             </w:r>
           </w:p>
         </w:tc>
@@ -2026,7 +2204,7 @@
                 <w:sz w:val="19"/>
                 <w:szCs w:val="19"/>
               </w:rPr>
-              <w:t xml:space="preserve">Bank soal: semua paket yang terlihat oleh Anda, dari kisi-kisi sampai hasil.</w:t>
+              <w:t xml:space="preserve">Membantu siswa yang lupa NISN. Guru melihat kelas yang diampunya.</w:t>
             </w:r>
           </w:p>
         </w:tc>
@@ -2050,7 +2228,7 @@
                 <w:sz w:val="19"/>
                 <w:szCs w:val="19"/>
               </w:rPr>
-              <w:t xml:space="preserve">guru, operator</w:t>
+              <w:t xml:space="preserve">guru, pengawas</w:t>
             </w:r>
           </w:p>
         </w:tc>
@@ -2080,7 +2258,7 @@
                 <w:sz w:val="19"/>
                 <w:szCs w:val="19"/>
               </w:rPr>
-              <w:t xml:space="preserve">Daftar Siswa</w:t>
+              <w:t xml:space="preserve">Asesmen Bersama</w:t>
             </w:r>
           </w:p>
         </w:tc>
@@ -2103,7 +2281,7 @@
                 <w:sz w:val="19"/>
                 <w:szCs w:val="19"/>
               </w:rPr>
-              <w:t xml:space="preserve">Membantu siswa yang lupa NISN.</w:t>
+              <w:t xml:space="preserve">Ujian bersama (PAS, tryout bersama): peserta per ruang, jadwal, folder soal, terbitkan, cetak.</w:t>
             </w:r>
           </w:p>
         </w:tc>
@@ -2126,7 +2304,7 @@
                 <w:sz w:val="19"/>
                 <w:szCs w:val="19"/>
               </w:rPr>
-              <w:t xml:space="preserve">semua</w:t>
+              <w:t xml:space="preserve">operator</w:t>
             </w:r>
           </w:p>
         </w:tc>
@@ -2157,7 +2335,7 @@
                 <w:sz w:val="19"/>
                 <w:szCs w:val="19"/>
               </w:rPr>
-              <w:t xml:space="preserve">Admin</w:t>
+              <w:t xml:space="preserve">Kontrol Pelaksanaan</w:t>
             </w:r>
           </w:p>
         </w:tc>
@@ -2181,7 +2359,7 @@
                 <w:sz w:val="19"/>
                 <w:szCs w:val="19"/>
               </w:rPr>
-              <w:t xml:space="preserve">Data siswa, PIN guru, impor kode hasil, cadangan, arsip semester.</w:t>
+              <w:t xml:space="preserve">Layar ruang untuk pengawas: kode ruang, siswa terkunci/tidak aktif, buka kunci, jeda, pesan.</w:t>
             </w:r>
           </w:p>
         </w:tc>
@@ -2189,6 +2367,82 @@
           <w:tcPr>
             <w:tcW w:type="dxa" w:w="2336"/>
             <w:shd w:fill="F6F8FB" w:color="auto" w:val="clear"/>
+            <w:tcMar>
+              <w:top w:type="dxa" w:w="70"/>
+              <w:left w:type="dxa" w:w="110"/>
+              <w:bottom w:type="dxa" w:w="70"/>
+              <w:right w:type="dxa" w:w="110"/>
+            </w:tcMar>
+          </w:tcPr>
+          <w:p>
+            <w:pPr>
+              <w:spacing w:after="0"/>
+            </w:pPr>
+            <w:r>
+              <w:rPr>
+                <w:sz w:val="19"/>
+                <w:szCs w:val="19"/>
+              </w:rPr>
+              <w:t xml:space="preserve">operator, pengawas</w:t>
+            </w:r>
+          </w:p>
+        </w:tc>
+      </w:tr>
+      <w:tr>
+        <w:trPr>
+          <w:cantSplit/>
+        </w:trPr>
+        <w:tc>
+          <w:tcPr>
+            <w:tcW w:type="dxa" w:w="2044"/>
+            <w:tcMar>
+              <w:top w:type="dxa" w:w="70"/>
+              <w:left w:type="dxa" w:w="110"/>
+              <w:bottom w:type="dxa" w:w="70"/>
+              <w:right w:type="dxa" w:w="110"/>
+            </w:tcMar>
+          </w:tcPr>
+          <w:p>
+            <w:pPr>
+              <w:spacing w:after="0"/>
+            </w:pPr>
+            <w:r>
+              <w:rPr>
+                <w:b/>
+                <w:bCs/>
+                <w:sz w:val="19"/>
+                <w:szCs w:val="19"/>
+              </w:rPr>
+              <w:t xml:space="preserve">Admin</w:t>
+            </w:r>
+          </w:p>
+        </w:tc>
+        <w:tc>
+          <w:tcPr>
+            <w:tcW w:type="dxa" w:w="5257"/>
+            <w:tcMar>
+              <w:top w:type="dxa" w:w="70"/>
+              <w:left w:type="dxa" w:w="110"/>
+              <w:bottom w:type="dxa" w:w="70"/>
+              <w:right w:type="dxa" w:w="110"/>
+            </w:tcMar>
+          </w:tcPr>
+          <w:p>
+            <w:pPr>
+              <w:spacing w:after="0"/>
+            </w:pPr>
+            <w:r>
+              <w:rPr>
+                <w:sz w:val="19"/>
+                <w:szCs w:val="19"/>
+              </w:rPr>
+              <w:t xml:space="preserve">Data siswa, PIN guru, pustaka paket, impor kode hasil, cadangan, arsip semester.</w:t>
+            </w:r>
+          </w:p>
+        </w:tc>
+        <w:tc>
+          <w:tcPr>
+            <w:tcW w:type="dxa" w:w="2336"/>
             <w:tcMar>
               <w:top w:type="dxa" w:w="70"/>
               <w:left w:type="dxa" w:w="110"/>
@@ -2676,7 +2930,7 @@
                 <w:sz w:val="19"/>
                 <w:szCs w:val="19"/>
               </w:rPr>
-              <w:t xml:space="preserve">Pembukaan satu paket untuk peserta tertentu dalam rentang waktu tertentu, dengan kode akses 6 angka sendiri.</w:t>
+              <w:t xml:space="preserve">Pembukaan satu paket untuk peserta tertentu dalam rentang waktu tertentu (boleh terjadwal), dengan kode akses 6 angka sendiri atau tanpa kode akses (cukup NISN).</w:t>
             </w:r>
           </w:p>
         </w:tc>
@@ -2848,40 +3102,50 @@
           <w:b/>
           <w:bCs/>
         </w:rPr>
-        <w:t xml:space="preserve">Menu guru → Upload Soal</w:t>
-      </w:r>
-      <w:r>
-        <w:t xml:space="preserve">. Halaman ini punya tiga tab: </w:t>
+        <w:t xml:space="preserve">Menu guru → Pustaka Paket</w:t>
+      </w:r>
+      <w:r>
+        <w:t xml:space="preserve">, lalu tekan </w:t>
       </w:r>
       <w:r>
         <w:rPr>
           <w:b/>
           <w:bCs/>
         </w:rPr>
-        <w:t xml:space="preserve">Langkah 1 · Kisi-kisi</w:t>
-      </w:r>
-      <w:r>
-        <w:t xml:space="preserve">, </w:t>
+        <w:t xml:space="preserve">+ Upload soal</w:t>
+      </w:r>
+      <w:r>
+        <w:t xml:space="preserve">. Ada tiga tab upload: </w:t>
       </w:r>
       <w:r>
         <w:rPr>
           <w:b/>
           <w:bCs/>
         </w:rPr>
-        <w:t xml:space="preserve">Langkah 2 · Soal</w:t>
-      </w:r>
-      <w:r>
-        <w:t xml:space="preserve">, dan </w:t>
+        <w:t xml:space="preserve">Langkah 1 · Kisi-kisi</w:t>
+      </w:r>
+      <w:r>
+        <w:t xml:space="preserve">, </w:t>
       </w:r>
       <w:r>
         <w:rPr>
           <w:b/>
           <w:bCs/>
         </w:rPr>
-        <w:t xml:space="preserve">Jalur Darurat</w:t>
-      </w:r>
-      <w:r>
-        <w:t xml:space="preserve">. Jalur biasa selalu Langkah 1 lalu Langkah 2.</w:t>
+        <w:t xml:space="preserve">Langkah 2 · Soal</w:t>
+      </w:r>
+      <w:r>
+        <w:t xml:space="preserve">, dan </w:t>
+      </w:r>
+      <w:r>
+        <w:rPr>
+          <w:b/>
+          <w:bCs/>
+        </w:rPr>
+        <w:t xml:space="preserve">Tanpa Kisi-kisi</w:t>
+      </w:r>
+      <w:r>
+        <w:t xml:space="preserve">. Dengan kisi-kisi: Langkah 1 lalu Langkah 2. Tanpa kisi-kisi: cukup satu berkas soal, kisi-kisinya disusun sistem.</w:t>
       </w:r>
     </w:p>
     <w:p>
@@ -3148,23 +3412,23 @@
                 <w:sz w:val="19"/>
                 <w:szCs w:val="19"/>
               </w:rPr>
-              <w:t xml:space="preserve">Pilih salah satu: Latihan Harian / Asesmen Formatif / Asesmen Sumatif / Tryout TKA / Tryout UTBK. Kosong atau tidak dikenali = </w:t>
-            </w:r>
-            <w:r>
-              <w:rPr>
-                <w:b/>
-                <w:bCs/>
-                <w:sz w:val="19"/>
-                <w:szCs w:val="19"/>
-              </w:rPr>
-              <w:t xml:space="preserve">Latihan Harian</w:t>
-            </w:r>
-            <w:r>
-              <w:rPr>
-                <w:sz w:val="19"/>
-                <w:szCs w:val="19"/>
-              </w:rPr>
-              <w:t xml:space="preserve">. Ulangan harian, PTS, PAS, SAS dibaca sebagai Asesmen Sumatif; TKA, UTBK, SNBT dikenali. Daftar jenis ditentukan sistem dan hanya bertambah bila operator membuat asesmen baru di PAS / Ujian Bersama (paket naskah PAS otomatis berjenis nama asesmen itu).</w:t>
+              <w:t xml:space="preserve">Pilih salah satu: Asesmen Formatif / Asesmen Sumatif / Tryout ASAS / Tryout TKA / Tryout UTBK. Kosong atau tidak dikenali = </w:t>
+            </w:r>
+            <w:r>
+              <w:rPr>
+                <w:b/>
+                <w:bCs/>
+                <w:sz w:val="19"/>
+                <w:szCs w:val="19"/>
+              </w:rPr>
+              <w:t xml:space="preserve">Asesmen Formatif</w:t>
+            </w:r>
+            <w:r>
+              <w:rPr>
+                <w:sz w:val="19"/>
+                <w:szCs w:val="19"/>
+              </w:rPr>
+              <w:t xml:space="preserve">. Latihan dibaca sebagai Asesmen Formatif; ulangan harian, PTS, PAS, SAS sebagai Asesmen Sumatif; ASAS, TKA, UTBK, SNBT dikenali. Daftar jenis ditentukan sistem dan hanya bertambah bila operator membuat asesmen baru di Asesmen Bersama (paket naskahnya otomatis berjenis nama asesmen itu).</w:t>
             </w:r>
           </w:p>
         </w:tc>
@@ -5756,7 +6020,7 @@
         <w:pStyle w:val="Heading2"/>
       </w:pPr>
       <w:r>
-        <w:t xml:space="preserve">2.6 Jalur darurat</w:t>
+        <w:t xml:space="preserve">2.6 Upload tanpa kisi-kisi</w:t>
       </w:r>
     </w:p>
     <w:p>
@@ -5764,85 +6028,75 @@
         <w:spacing w:after="120"/>
       </w:pPr>
       <w:r>
-        <w:t xml:space="preserve">Untuk keadaan mendesak, paket bisa diterbitkan tanpa Langkah 1 lewat tab </w:t>
+        <w:t xml:space="preserve">Soal yang sudah jadi bisa diterbitkan tanpa Langkah 1 lewat tab </w:t>
       </w:r>
       <w:r>
         <w:rPr>
           <w:b/>
           <w:bCs/>
         </w:rPr>
-        <w:t xml:space="preserve">Jalur Darurat</w:t>
-      </w:r>
-      <w:r>
-        <w:t xml:space="preserve"> dengan </w:t>
+        <w:t xml:space="preserve">Tanpa Kisi-kisi</w:t>
+      </w:r>
+      <w:r>
+        <w:t xml:space="preserve">, cukup dengan PIN pribadi Anda (paket otomatis atas nama Anda). Ada dua cara menyiapkan berkas: </w:t>
       </w:r>
       <w:r>
         <w:rPr>
           <w:b/>
           <w:bCs/>
         </w:rPr>
-        <w:t xml:space="preserve">PIN darurat</w:t>
-      </w:r>
-      <w:r>
-        <w:t xml:space="preserve"> (dipegang pimpinan/kurikulum). Ada dua cara menyiapkan berkas: </w:t>
+        <w:t xml:space="preserve">Unduh template tanpa kisi-kisi</w:t>
+      </w:r>
+      <w:r>
+        <w:t xml:space="preserve"> (memindahkan soal sendiri) atau </w:t>
       </w:r>
       <w:r>
         <w:rPr>
           <w:b/>
           <w:bCs/>
         </w:rPr>
-        <w:t xml:space="preserve">Unduh template darurat</w:t>
-      </w:r>
-      <w:r>
-        <w:t xml:space="preserve"> (memindahkan soal sendiri) atau </w:t>
+        <w:t xml:space="preserve">Unduh prompt AI / Salin prompt</w:t>
+      </w:r>
+      <w:r>
+        <w:t xml:space="preserve"> (meminta bantuan ChatGPT/Gemini/Claude). Setiap soal wajib mengisi Bentuk dan Level; aplikasi menyusun kisi-kisi otomatis.</w:t>
+      </w:r>
+    </w:p>
+    <w:p>
+      <w:pPr>
+        <w:spacing w:after="120"/>
+      </w:pPr>
+      <w:r>
+        <w:t xml:space="preserve">Paket ini setara paket biasa dan hanya diberi tanda kecil </w:t>
       </w:r>
       <w:r>
         <w:rPr>
           <w:b/>
           <w:bCs/>
         </w:rPr>
-        <w:t xml:space="preserve">Unduh prompt AI / Salin prompt</w:t>
-      </w:r>
-      <w:r>
-        <w:t xml:space="preserve"> (meminta bantuan ChatGPT/Gemini/Claude). Setiap soal wajib mengisi Bentuk dan Level; aplikasi menyusun kisi-kisi otomatis.</w:t>
-      </w:r>
-    </w:p>
-    <w:p>
-      <w:pPr>
-        <w:spacing w:after="120"/>
-      </w:pPr>
-      <w:r>
-        <w:t xml:space="preserve">Paket darurat diberi tanda merah </w:t>
+        <w:t xml:space="preserve">kisi-kisi otomatis</w:t>
+      </w:r>
+      <w:r>
+        <w:t xml:space="preserve">. Kisi-kisinya boleh dilengkapi kapan saja (tidak wajib): </w:t>
       </w:r>
       <w:r>
         <w:rPr>
           <w:b/>
           <w:bCs/>
         </w:rPr>
-        <w:t xml:space="preserve">Darurat</w:t>
-      </w:r>
-      <w:r>
-        <w:t xml:space="preserve">. Untuk mengesahkannya: </w:t>
+        <w:t xml:space="preserve">Pustaka Paket → buka paket → Kisi-kisi .docx</w:t>
+      </w:r>
+      <w:r>
+        <w:t xml:space="preserve">, lengkapi di Word, lalu unggah di </w:t>
       </w:r>
       <w:r>
         <w:rPr>
           <w:b/>
           <w:bCs/>
         </w:rPr>
-        <w:t xml:space="preserve">Pustaka Paket → buka paket → Kisi-kisi .docx</w:t>
-      </w:r>
-      <w:r>
-        <w:t xml:space="preserve">, periksa dan lengkapi di Word, lalu unggah di </w:t>
-      </w:r>
-      <w:r>
-        <w:rPr>
-          <w:b/>
-          <w:bCs/>
-        </w:rPr>
         <w:t xml:space="preserve">Langkah 1</w:t>
       </w:r>
       <w:r>
-        <w:t xml:space="preserve"> dengan kode yang sama. Bila nomor dan bentuknya cocok, tanda Darurat dicabut.</w:t>
+        <w:t xml:space="preserve"> dengan kode yang sama. Bila nomor dan bentuknya cocok, tandanya dicabut.</w:t>
       </w:r>
     </w:p>
     <w:p>
@@ -6060,22 +6314,6 @@
               </w:rPr>
               <w:t xml:space="preserve">Operator</w:t>
             </w:r>
-            <w:r>
-              <w:rPr>
-                <w:sz w:val="19"/>
-                <w:szCs w:val="19"/>
-              </w:rPr>
-              <w:t xml:space="preserve"> dan </w:t>
-            </w:r>
-            <w:r>
-              <w:rPr>
-                <w:b/>
-                <w:bCs/>
-                <w:sz w:val="19"/>
-                <w:szCs w:val="19"/>
-              </w:rPr>
-              <w:t xml:space="preserve">pengawas</w:t>
-            </w:r>
           </w:p>
         </w:tc>
         <w:tc>
@@ -6098,7 +6336,7 @@
                 <w:sz w:val="19"/>
                 <w:szCs w:val="19"/>
               </w:rPr>
-              <w:t xml:space="preserve">Semua paket. Pengawas hanya melihat paket yang sudah terbit dan tidak bisa mengubah apa pun.</w:t>
+              <w:t xml:space="preserve">Semua paket (lewat Admin → Pustaka Paket). Pengawas tidak memakai Pustaka Paket.</w:t>
             </w:r>
           </w:p>
         </w:tc>
@@ -6150,7 +6388,7 @@
         <w:t xml:space="preserve">Perlu tindakan</w:t>
       </w:r>
       <w:r>
-        <w:t xml:space="preserve"> yang menghitung: kisi-kisi menunggu soal, paket darurat belum disahkan, paket dibuka tanpa peserta, dan paket yang keterangannya belum lengkap (jenis, penyusun, atau tingkat kosong). Ketuk salah satunya untuk menyaring. Bila tidak ada: *Tidak ada. Semua paket dalam keadaan baik.*</w:t>
+        <w:t xml:space="preserve"> yang menghitung: kisi-kisi menunggu soal, paket dibuka tanpa peserta, dan paket yang keterangannya belum lengkap (jenis, penyusun, atau tingkat kosong). Ketuk salah satunya untuk menyaring. Bila tidak ada: *Tidak ada. Semua paket dalam keadaan baik.*</w:t>
       </w:r>
     </w:p>
     <w:p>
@@ -6740,17 +6978,17 @@
         <w:t xml:space="preserve">Kisi-kisi → Soal → Dibuka/Ditutup → Hasil</w:t>
       </w:r>
       <w:r>
-        <w:t xml:space="preserve">. Tanda di judul: jenis paket, </w:t>
+        <w:t xml:space="preserve">. Tanda di judul: jenis paket (bila tidak dikelompokkan menurut jenis), </w:t>
       </w:r>
       <w:r>
         <w:rPr>
           <w:b/>
           <w:bCs/>
         </w:rPr>
-        <w:t xml:space="preserve">Darurat</w:t>
-      </w:r>
-      <w:r>
-        <w:t xml:space="preserve"> (merah), dan </w:t>
+        <w:t xml:space="preserve">kisi-kisi otomatis</w:t>
+      </w:r>
+      <w:r>
+        <w:t xml:space="preserve">, dan </w:t>
       </w:r>
       <w:r>
         <w:rPr>
@@ -6758,6 +6996,16 @@
           <w:bCs/>
         </w:rPr>
         <w:t xml:space="preserve">Belum publish</w:t>
+      </w:r>
+      <w:r>
+        <w:t xml:space="preserve">. Daftar bawaannya dikelompokkan menurut </w:t>
+      </w:r>
+      <w:r>
+        <w:rPr>
+          <w:b/>
+          <w:bCs/>
+        </w:rPr>
+        <w:t xml:space="preserve">jenis</w:t>
       </w:r>
       <w:r>
         <w:t xml:space="preserve">.</w:t>
@@ -7688,7 +7936,7 @@
         <w:t xml:space="preserve">Belum publish</w:t>
       </w:r>
       <w:r>
-        <w:t xml:space="preserve">: hanya Anda, operator, dan pengawas yang melihatnya. Untuk membagikannya kepada guru lain (mis. satu tim mapel), buka rincian paket dan tekan </w:t>
+        <w:t xml:space="preserve">: hanya Anda dan operator yang melihatnya. Untuk membagikannya kepada guru lain (mis. satu tim mapel), buka rincian paket dan tekan </w:t>
       </w:r>
       <w:r>
         <w:rPr>
@@ -8333,7 +8581,7 @@
         <w:pageBreakBefore/>
       </w:pPr>
       <w:r>
-        <w:t xml:space="preserve">4. Sesi Ujian</w:t>
+        <w:t xml:space="preserve">4. Latihan / Tryout</w:t>
       </w:r>
     </w:p>
     <w:p>
@@ -8345,10 +8593,10 @@
           <w:b/>
           <w:bCs/>
         </w:rPr>
-        <w:t xml:space="preserve">Menu guru → Sesi Ujian</w:t>
-      </w:r>
-      <w:r>
-        <w:t xml:space="preserve"> menampilkan sesi yang </w:t>
+        <w:t xml:space="preserve">Menu guru → Latihan / Tryout</w:t>
+      </w:r>
+      <w:r>
+        <w:t xml:space="preserve"> (dulu *Sesi Ujian*) menampilkan sesi yang </w:t>
       </w:r>
       <w:r>
         <w:rPr>
@@ -8358,43 +8606,53 @@
         <w:t xml:space="preserve">sedang dibuka</w:t>
       </w:r>
       <w:r>
-        <w:t xml:space="preserve"> dan yang </w:t>
+        <w:t xml:space="preserve">, yang </w:t>
       </w:r>
       <w:r>
         <w:rPr>
           <w:b/>
           <w:bCs/>
         </w:rPr>
-        <w:t xml:space="preserve">ditutup dalam 12 jam terakhir</w:t>
-      </w:r>
-      <w:r>
-        <w:t xml:space="preserve">, diperbarui otomatis tiap 20 detik. Sesi yang lebih lama tetap terlihat di Dasbor Hasil (kartu *Sesi ujian untuk paket ini*).</w:t>
-      </w:r>
-    </w:p>
-    <w:p>
-      <w:pPr>
-        <w:pStyle w:val="Heading2"/>
-      </w:pPr>
-      <w:r>
-        <w:t xml:space="preserve">4.1 Membuka sesi baru</w:t>
-      </w:r>
-    </w:p>
-    <w:p>
-      <w:pPr>
-        <w:spacing w:after="120"/>
-      </w:pPr>
-      <w:r>
-        <w:t xml:space="preserve">Tekan </w:t>
+        <w:t xml:space="preserve">terjadwal</w:t>
+      </w:r>
+      <w:r>
+        <w:t xml:space="preserve">, dan yang </w:t>
       </w:r>
       <w:r>
         <w:rPr>
           <w:b/>
           <w:bCs/>
         </w:rPr>
-        <w:t xml:space="preserve">+ Buka sesi baru</w:t>
-      </w:r>
-      <w:r>
-        <w:t xml:space="preserve"> (tidak ada untuk pengawas), lalu isi:</w:t>
+        <w:t xml:space="preserve">ditutup dalam 12 jam terakhir</w:t>
+      </w:r>
+      <w:r>
+        <w:t xml:space="preserve">, diperbarui otomatis tiap 20 detik. Sesi yang lebih lama tetap terlihat di Dasbor Hasil (kartu *Sesi ujian untuk paket ini*).</w:t>
+      </w:r>
+    </w:p>
+    <w:p>
+      <w:pPr>
+        <w:pStyle w:val="Heading2"/>
+      </w:pPr>
+      <w:r>
+        <w:t xml:space="preserve">4.1 Membuka latihan / tryout</w:t>
+      </w:r>
+    </w:p>
+    <w:p>
+      <w:pPr>
+        <w:spacing w:after="120"/>
+      </w:pPr>
+      <w:r>
+        <w:t xml:space="preserve">Tekan </w:t>
+      </w:r>
+      <w:r>
+        <w:rPr>
+          <w:b/>
+          <w:bCs/>
+        </w:rPr>
+        <w:t xml:space="preserve">+ Buka latihan / tryout</w:t>
+      </w:r>
+      <w:r>
+        <w:t xml:space="preserve">, lalu isi:</w:t>
       </w:r>
     </w:p>
     <w:tbl>
@@ -8711,14 +8969,7 @@
                 <w:sz w:val="19"/>
                 <w:szCs w:val="19"/>
               </w:rPr>
-              <w:t xml:space="preserve">Lama pengerjaan</w:t>
-            </w:r>
-            <w:r>
-              <w:rPr>
-                <w:sz w:val="19"/>
-                <w:szCs w:val="19"/>
-              </w:rPr>
-              <w:t xml:space="preserve"> (menit)</w:t>
+              <w:t xml:space="preserve">Cara siswa masuk</w:t>
             </w:r>
           </w:p>
         </w:tc>
@@ -8738,10 +8989,35 @@
             </w:pPr>
             <w:r>
               <w:rPr>
-                <w:sz w:val="19"/>
-                <w:szCs w:val="19"/>
-              </w:rPr>
-              <w:t xml:space="preserve">Waktu untuk tiap siswa sejak ia masuk. Terisi dari durasi paket; 5–300 menit.</w:t>
+                <w:b/>
+                <w:bCs/>
+                <w:sz w:val="19"/>
+                <w:szCs w:val="19"/>
+              </w:rPr>
+              <w:t xml:space="preserve">Dengan kode akses</w:t>
+            </w:r>
+            <w:r>
+              <w:rPr>
+                <w:sz w:val="19"/>
+                <w:szCs w:val="19"/>
+              </w:rPr>
+              <w:t xml:space="preserve">: siswa mengetik NISN + kode 6 angka yang Anda umumkan. </w:t>
+            </w:r>
+            <w:r>
+              <w:rPr>
+                <w:b/>
+                <w:bCs/>
+                <w:sz w:val="19"/>
+                <w:szCs w:val="19"/>
+              </w:rPr>
+              <w:t xml:space="preserve">Tanpa kode akses (cukup NISN)</w:t>
+            </w:r>
+            <w:r>
+              <w:rPr>
+                <w:sz w:val="19"/>
+                <w:szCs w:val="19"/>
+              </w:rPr>
+              <w:t xml:space="preserve">: selama jam sesi, siswa kelas peserta cukup membuka halaman depan dan mengetik NISN; siswa di luar peserta ditolak. Tanpa kode hanya untuk kelas atau siswa tertentu (bukan semua siswa).</w:t>
             </w:r>
           </w:p>
         </w:tc>
@@ -8772,14 +9048,7 @@
                 <w:sz w:val="19"/>
                 <w:szCs w:val="19"/>
               </w:rPr>
-              <w:t xml:space="preserve">Kelonggaran masuk</w:t>
-            </w:r>
-            <w:r>
-              <w:rPr>
-                <w:sz w:val="19"/>
-                <w:szCs w:val="19"/>
-              </w:rPr>
-              <w:t xml:space="preserve"> (menit)</w:t>
+              <w:t xml:space="preserve">Mulai</w:t>
             </w:r>
           </w:p>
         </w:tc>
@@ -8800,6 +9069,153 @@
             </w:pPr>
             <w:r>
               <w:rPr>
+                <w:b/>
+                <w:bCs/>
+                <w:sz w:val="19"/>
+                <w:szCs w:val="19"/>
+              </w:rPr>
+              <w:t xml:space="preserve">Sekarang</w:t>
+            </w:r>
+            <w:r>
+              <w:rPr>
+                <w:sz w:val="19"/>
+                <w:szCs w:val="19"/>
+              </w:rPr>
+              <w:t xml:space="preserve">, atau </w:t>
+            </w:r>
+            <w:r>
+              <w:rPr>
+                <w:b/>
+                <w:bCs/>
+                <w:sz w:val="19"/>
+                <w:szCs w:val="19"/>
+              </w:rPr>
+              <w:t xml:space="preserve">Jadwalkan</w:t>
+            </w:r>
+            <w:r>
+              <w:rPr>
+                <w:sz w:val="19"/>
+                <w:szCs w:val="19"/>
+              </w:rPr>
+              <w:t xml:space="preserve"> tanggal dan jam (paling jauh 7 hari ke depan; bawaan besok 07.00). Sebelum jamnya, siswa diberi tahu *baru dimulai pukul …*.</w:t>
+            </w:r>
+          </w:p>
+        </w:tc>
+      </w:tr>
+      <w:tr>
+        <w:trPr>
+          <w:cantSplit/>
+        </w:trPr>
+        <w:tc>
+          <w:tcPr>
+            <w:tcW w:type="dxa" w:w="2521"/>
+            <w:tcMar>
+              <w:top w:type="dxa" w:w="70"/>
+              <w:left w:type="dxa" w:w="110"/>
+              <w:bottom w:type="dxa" w:w="70"/>
+              <w:right w:type="dxa" w:w="110"/>
+            </w:tcMar>
+          </w:tcPr>
+          <w:p>
+            <w:pPr>
+              <w:spacing w:after="0"/>
+            </w:pPr>
+            <w:r>
+              <w:rPr>
+                <w:b/>
+                <w:bCs/>
+                <w:sz w:val="19"/>
+                <w:szCs w:val="19"/>
+              </w:rPr>
+              <w:t xml:space="preserve">Lama pengerjaan</w:t>
+            </w:r>
+            <w:r>
+              <w:rPr>
+                <w:sz w:val="19"/>
+                <w:szCs w:val="19"/>
+              </w:rPr>
+              <w:t xml:space="preserve"> (menit)</w:t>
+            </w:r>
+          </w:p>
+        </w:tc>
+        <w:tc>
+          <w:tcPr>
+            <w:tcW w:type="dxa" w:w="7117"/>
+            <w:tcMar>
+              <w:top w:type="dxa" w:w="70"/>
+              <w:left w:type="dxa" w:w="110"/>
+              <w:bottom w:type="dxa" w:w="70"/>
+              <w:right w:type="dxa" w:w="110"/>
+            </w:tcMar>
+          </w:tcPr>
+          <w:p>
+            <w:pPr>
+              <w:spacing w:after="0"/>
+            </w:pPr>
+            <w:r>
+              <w:rPr>
+                <w:sz w:val="19"/>
+                <w:szCs w:val="19"/>
+              </w:rPr>
+              <w:t xml:space="preserve">Waktu untuk tiap siswa sejak ia masuk. Terisi dari durasi paket; 5–300 menit.</w:t>
+            </w:r>
+          </w:p>
+        </w:tc>
+      </w:tr>
+      <w:tr>
+        <w:trPr>
+          <w:cantSplit/>
+        </w:trPr>
+        <w:tc>
+          <w:tcPr>
+            <w:tcW w:type="dxa" w:w="2521"/>
+            <w:shd w:fill="F6F8FB" w:color="auto" w:val="clear"/>
+            <w:tcMar>
+              <w:top w:type="dxa" w:w="70"/>
+              <w:left w:type="dxa" w:w="110"/>
+              <w:bottom w:type="dxa" w:w="70"/>
+              <w:right w:type="dxa" w:w="110"/>
+            </w:tcMar>
+          </w:tcPr>
+          <w:p>
+            <w:pPr>
+              <w:spacing w:after="0"/>
+            </w:pPr>
+            <w:r>
+              <w:rPr>
+                <w:b/>
+                <w:bCs/>
+                <w:sz w:val="19"/>
+                <w:szCs w:val="19"/>
+              </w:rPr>
+              <w:t xml:space="preserve">Kelonggaran masuk</w:t>
+            </w:r>
+            <w:r>
+              <w:rPr>
+                <w:sz w:val="19"/>
+                <w:szCs w:val="19"/>
+              </w:rPr>
+              <w:t xml:space="preserve"> (menit)</w:t>
+            </w:r>
+          </w:p>
+        </w:tc>
+        <w:tc>
+          <w:tcPr>
+            <w:tcW w:type="dxa" w:w="7117"/>
+            <w:shd w:fill="F6F8FB" w:color="auto" w:val="clear"/>
+            <w:tcMar>
+              <w:top w:type="dxa" w:w="70"/>
+              <w:left w:type="dxa" w:w="110"/>
+              <w:bottom w:type="dxa" w:w="70"/>
+              <w:right w:type="dxa" w:w="110"/>
+            </w:tcMar>
+          </w:tcPr>
+          <w:p>
+            <w:pPr>
+              <w:spacing w:after="0"/>
+            </w:pPr>
+            <w:r>
+              <w:rPr>
                 <w:sz w:val="19"/>
                 <w:szCs w:val="19"/>
               </w:rPr>
@@ -8833,7 +9249,7 @@
                 <w:sz w:val="19"/>
                 <w:szCs w:val="19"/>
               </w:rPr>
-              <w:t xml:space="preserve">Sesi tertutup pukul</w:t>
+              <w:t xml:space="preserve">Sesi tertutup</w:t>
             </w:r>
           </w:p>
         </w:tc>
@@ -8856,7 +9272,7 @@
                 <w:sz w:val="19"/>
                 <w:szCs w:val="19"/>
               </w:rPr>
-              <w:t xml:space="preserve">Dihitung otomatis: sekarang + lama pengerjaan + kelonggaran. Sesudahnya siswa tidak bisa masuk.</w:t>
+              <w:t xml:space="preserve">Dihitung otomatis: jam mulai + lama pengerjaan + kelonggaran. Sesudahnya siswa tidak bisa masuk.</w:t>
             </w:r>
           </w:p>
         </w:tc>
@@ -9307,7 +9723,7 @@
           <w:b/>
           <w:bCs/>
         </w:rPr>
-        <w:t xml:space="preserve">Buka sesi</w:t>
+        <w:t xml:space="preserve">Buka</w:t>
       </w:r>
       <w:r>
         <w:t xml:space="preserve">: server memberi </w:t>
@@ -9320,8 +9736,105 @@
         <w:t xml:space="preserve">kode akses 6 angka</w:t>
       </w:r>
       <w:r>
-        <w:t xml:space="preserve"> dan layar kode besar langsung tampil.</w:t>
-      </w:r>
+        <w:t xml:space="preserve"> dan layar kode besar langsung tampil. Pada sesi tanpa kode akses, layar itu menampilkan alamat halaman siswa + QR dengan tulisan *Cukup NISN*; kode 6 angka tetap ada sebagai cadangan.</w:t>
+      </w:r>
+    </w:p>
+    <w:tbl>
+      <w:tblPr>
+        <w:tblW w:type="dxa" w:w="9638"/>
+        <w:tblBorders>
+          <w:top w:val="none" w:color="FFFFFF" w:sz="0"/>
+          <w:left w:val="single" w:color="2E9E5B" w:sz="30"/>
+          <w:bottom w:val="none" w:color="FFFFFF" w:sz="0"/>
+          <w:right w:val="none" w:color="FFFFFF" w:sz="0"/>
+          <w:insideH w:val="none" w:color="FFFFFF" w:sz="0"/>
+          <w:insideV w:val="none" w:color="FFFFFF" w:sz="0"/>
+        </w:tblBorders>
+      </w:tblPr>
+      <w:tblGrid>
+        <w:gridCol w:w="9638"/>
+      </w:tblGrid>
+      <w:tr>
+        <w:trPr>
+          <w:cantSplit/>
+        </w:trPr>
+        <w:tc>
+          <w:tcPr>
+            <w:tcW w:type="dxa" w:w="9638"/>
+            <w:shd w:fill="E7F5EC" w:color="auto" w:val="clear"/>
+            <w:tcMar>
+              <w:top w:type="dxa" w:w="120"/>
+              <w:left w:type="dxa" w:w="200"/>
+              <w:bottom w:type="dxa" w:w="120"/>
+              <w:right w:type="dxa" w:w="160"/>
+            </w:tcMar>
+          </w:tcPr>
+          <w:p>
+            <w:pPr>
+              <w:spacing w:after="40"/>
+            </w:pPr>
+            <w:r>
+              <w:rPr>
+                <w:b/>
+                <w:bCs/>
+                <w:color w:val="2E9E5B"/>
+                <w:sz w:val="20"/>
+                <w:szCs w:val="20"/>
+              </w:rPr>
+              <w:t xml:space="preserve">Contoh: literasi mingguan jam pertama</w:t>
+            </w:r>
+          </w:p>
+          <w:p>
+            <w:pPr>
+              <w:spacing w:after="40"/>
+            </w:pPr>
+            <w:r>
+              <w:rPr>
+                <w:sz w:val="19"/>
+                <w:szCs w:val="19"/>
+              </w:rPr>
+              <w:t xml:space="preserve">Malam sebelumnya Tim Literasi membuka paket dengan </w:t>
+            </w:r>
+            <w:r>
+              <w:rPr>
+                <w:b/>
+                <w:bCs/>
+                <w:sz w:val="19"/>
+                <w:szCs w:val="19"/>
+              </w:rPr>
+              <w:t xml:space="preserve">Tanpa kode akses</w:t>
+            </w:r>
+            <w:r>
+              <w:rPr>
+                <w:sz w:val="19"/>
+                <w:szCs w:val="19"/>
+              </w:rPr>
+              <w:t xml:space="preserve">, peserta kelas yang ikut, </w:t>
+            </w:r>
+            <w:r>
+              <w:rPr>
+                <w:b/>
+                <w:bCs/>
+                <w:sz w:val="19"/>
+                <w:szCs w:val="19"/>
+              </w:rPr>
+              <w:t xml:space="preserve">Jadwalkan</w:t>
+            </w:r>
+            <w:r>
+              <w:rPr>
+                <w:sz w:val="19"/>
+                <w:szCs w:val="19"/>
+              </w:rPr>
+              <w:t xml:space="preserve"> besok 07.00, lama pengerjaan 15 menit, kelonggaran 45 menit. Tautan halaman siswa dibagikan ke grup guru. Pagi harinya guru jam pertama cukup membagikan tautan; siswa mengetik NISN dan mengerjakan. Hasil masuk ke Dasbor Hasil Tim Literasi.</w:t>
+            </w:r>
+          </w:p>
+        </w:tc>
+      </w:tr>
+    </w:tbl>
+    <w:p>
+      <w:pPr>
+        <w:spacing w:after="120"/>
+      </w:pPr>
     </w:p>
     <w:p>
       <w:pPr>
@@ -9392,17 +9905,27 @@
         <w:t xml:space="preserve">Dibuka s.d. hh.mm</w:t>
       </w:r>
       <w:r>
-        <w:t xml:space="preserve"> atau </w:t>
+        <w:t xml:space="preserve">, </w:t>
       </w:r>
       <w:r>
         <w:rPr>
           <w:b/>
           <w:bCs/>
         </w:rPr>
+        <w:t xml:space="preserve">Terjadwal</w:t>
+      </w:r>
+      <w:r>
+        <w:t xml:space="preserve">, atau </w:t>
+      </w:r>
+      <w:r>
+        <w:rPr>
+          <w:b/>
+          <w:bCs/>
+        </w:rPr>
         <w:t xml:space="preserve">Ditutup hh.mm</w:t>
       </w:r>
       <w:r>
-        <w:t xml:space="preserve">, kode akses, aturan pengawasan, dan hitungan </w:t>
+        <w:t xml:space="preserve">, kode akses (atau *Cukup NISN*), aturan pengawasan, dan hitungan </w:t>
       </w:r>
       <w:r>
         <w:rPr>
@@ -11143,7 +11666,7 @@
         <w:t xml:space="preserve">Ujian yang ditampilkan</w:t>
       </w:r>
       <w:r>
-        <w:t xml:space="preserve"> berisi judul, jenis, tanda Darurat, kode, mapel, tingkat, jumlah soal, penyusun, status, dan kemajuan *hasil/peserta*. Tekan </w:t>
+        <w:t xml:space="preserve"> berisi judul, jenis, tanda kisi-kisi otomatis, kode, mapel, tingkat, jumlah soal, penyusun, status, dan kemajuan *hasil/peserta*. Tekan </w:t>
       </w:r>
       <w:r>
         <w:rPr>
@@ -12866,7 +13389,7 @@
         <w:t xml:space="preserve">Pantau siswa</w:t>
       </w:r>
       <w:r>
-        <w:t xml:space="preserve"> di Sesi Ujian.</w:t>
+        <w:t xml:space="preserve"> di Latihan / Tryout.</w:t>
       </w:r>
     </w:p>
     <w:p>
@@ -13527,7 +14050,7 @@
         <w:pStyle w:val="Heading2"/>
       </w:pPr>
       <w:r>
-        <w:t xml:space="preserve">5.10 Daftar Siswa</w:t>
+        <w:t xml:space="preserve">5.10 NISN Siswa</w:t>
       </w:r>
     </w:p>
     <w:p>
@@ -13539,10 +14062,10 @@
           <w:b/>
           <w:bCs/>
         </w:rPr>
-        <w:t xml:space="preserve">Menu guru → Daftar Siswa</w:t>
-      </w:r>
-      <w:r>
-        <w:t xml:space="preserve"> membantu siswa yang lupa NISN. Cari nama atau NISN, atau ketuk chip kelas; NISN tampil besar dengan tombol </w:t>
+        <w:t xml:space="preserve">Menu guru → NISN Siswa</w:t>
+      </w:r>
+      <w:r>
+        <w:t xml:space="preserve"> membantu siswa yang lupa NISN. Guru melihat kelas yang diampunya menurut jadwal KBM; pengawas dan operator melihat semua kelas. Cari nama atau NISN, atau ketuk chip kelas; NISN tampil besar dengan tombol </w:t>
       </w:r>
       <w:r>
         <w:rPr>
@@ -13839,7 +14362,7 @@
                 <w:sz w:val="19"/>
                 <w:szCs w:val="19"/>
               </w:rPr>
-              <w:t xml:space="preserve">Daftar Siswa</w:t>
+              <w:t xml:space="preserve">NISN Siswa</w:t>
             </w:r>
             <w:r>
               <w:rPr>

</xml_diff>

<commit_message>
Latihan/Tryout: teks daftar kosong untuk guru (sesi Anda); panduan diperbarui
Co-Authored-By: Claude Opus 5.5 <noreply@anthropic.com>
</commit_message>
<xml_diff>
--- a/Panduan_Guru_Asesmen_Merdeka.docx
+++ b/Panduan_Guru_Asesmen_Merdeka.docx
@@ -8596,7 +8596,17 @@
         <w:t xml:space="preserve">Menu guru → Latihan / Tryout</w:t>
       </w:r>
       <w:r>
-        <w:t xml:space="preserve"> (dulu *Sesi Ujian*) menampilkan sesi yang </w:t>
+        <w:t xml:space="preserve"> (dulu *Sesi Ujian*) menampilkan </w:t>
+      </w:r>
+      <w:r>
+        <w:rPr>
+          <w:b/>
+          <w:bCs/>
+        </w:rPr>
+        <w:t xml:space="preserve">sesi Anda</w:t>
+      </w:r>
+      <w:r>
+        <w:t xml:space="preserve"> (yang Anda buka, atau untuk paket yang Anda susun; operator melihat semua) yang </w:t>
       </w:r>
       <w:r>
         <w:rPr>

</xml_diff>

<commit_message>
Menu operator: tambah NISN Siswa (semua kelas)
Co-Authored-By: Claude Opus 5.5 <noreply@anthropic.com>
</commit_message>
<xml_diff>
--- a/Panduan_Guru_Asesmen_Merdeka.docx
+++ b/Panduan_Guru_Asesmen_Merdeka.docx
@@ -1692,6 +1692,22 @@
                 <w:sz w:val="19"/>
                 <w:szCs w:val="19"/>
               </w:rPr>
+              <w:t xml:space="preserve">NISN Siswa</w:t>
+            </w:r>
+            <w:r>
+              <w:rPr>
+                <w:sz w:val="19"/>
+                <w:szCs w:val="19"/>
+              </w:rPr>
+              <w:t xml:space="preserve">, </w:t>
+            </w:r>
+            <w:r>
+              <w:rPr>
+                <w:b/>
+                <w:bCs/>
+                <w:sz w:val="19"/>
+                <w:szCs w:val="19"/>
+              </w:rPr>
               <w:t xml:space="preserve">Admin</w:t>
             </w:r>
             <w:r>
@@ -2204,7 +2220,7 @@
                 <w:sz w:val="19"/>
                 <w:szCs w:val="19"/>
               </w:rPr>
-              <w:t xml:space="preserve">Membantu siswa yang lupa NISN. Guru melihat kelas yang diampunya.</w:t>
+              <w:t xml:space="preserve">Membantu siswa yang lupa NISN. Guru melihat kelas yang diampunya; operator dan pengawas semua kelas.</w:t>
             </w:r>
           </w:p>
         </w:tc>
@@ -2228,7 +2244,7 @@
                 <w:sz w:val="19"/>
                 <w:szCs w:val="19"/>
               </w:rPr>
-              <w:t xml:space="preserve">guru, pengawas</w:t>
+              <w:t xml:space="preserve">guru, operator, pengawas</w:t>
             </w:r>
           </w:p>
         </w:tc>

</xml_diff>

<commit_message>
Pustaka & upload: guru hanya mapel yang diampu (satu mapel langsung terpilih)
Co-Authored-By: Claude Opus 5.5 <noreply@anthropic.com>
</commit_message>
<xml_diff>
--- a/Panduan_Guru_Asesmen_Merdeka.docx
+++ b/Panduan_Guru_Asesmen_Merdeka.docx
@@ -2126,7 +2126,7 @@
                 <w:sz w:val="19"/>
                 <w:szCs w:val="19"/>
               </w:rPr>
-              <w:t xml:space="preserve">Bank soal per jenis: paket Anda dan paket teman semapel yang sudah Publish. Tombol </w:t>
+              <w:t xml:space="preserve">Bank soal per jenis, hanya mapel yang Anda ampu: paket Anda dan paket teman semapel yang sudah Publish. Tombol </w:t>
             </w:r>
             <w:r>
               <w:rPr>
@@ -3375,7 +3375,23 @@
                 <w:sz w:val="19"/>
                 <w:szCs w:val="19"/>
               </w:rPr>
-              <w:t xml:space="preserve">Isi nama mapel saja (mis. Kimia), sesuai daftar mapel Data Induk. Penulisan disamakan otomatis (kimia → Kimia); mapel di luar daftar diberi peringatan.</w:t>
+              <w:t xml:space="preserve">Isi nama mapel saja (mis. Kimia), sesuai daftar mapel Data Induk. Saat diunggah, mapel bisa dipilih ulang: guru yang mengampu </w:t>
+            </w:r>
+            <w:r>
+              <w:rPr>
+                <w:b/>
+                <w:bCs/>
+                <w:sz w:val="19"/>
+                <w:szCs w:val="19"/>
+              </w:rPr>
+              <w:t xml:space="preserve">satu</w:t>
+            </w:r>
+            <w:r>
+              <w:rPr>
+                <w:sz w:val="19"/>
+                <w:szCs w:val="19"/>
+              </w:rPr>
+              <w:t xml:space="preserve"> mapel langsung terisi mapelnya (terkunci); guru yang mengampu beberapa mapel memilih di antara mapel yang diampunya (menurut jadwal KBM; Upacara, Tahsin, dan kegiatan sekolah lain tidak dihitung).</w:t>
             </w:r>
           </w:p>
         </w:tc>

</xml_diff>

<commit_message>
Latihan/Tryout: terjadwal mulai…sampai, pilihan nilai saja / kunci & pembahasan
Co-Authored-By: Claude Opus 5.5 <noreply@anthropic.com>
</commit_message>
<xml_diff>
--- a/Panduan_Guru_Asesmen_Merdeka.docx
+++ b/Panduan_Guru_Asesmen_Merdeka.docx
@@ -9090,7 +9090,7 @@
                 <w:sz w:val="19"/>
                 <w:szCs w:val="19"/>
               </w:rPr>
-              <w:t xml:space="preserve">Mulai</w:t>
+              <w:t xml:space="preserve">Waktu</w:t>
             </w:r>
           </w:p>
         </w:tc>
@@ -9116,30 +9116,62 @@
                 <w:sz w:val="19"/>
                 <w:szCs w:val="19"/>
               </w:rPr>
-              <w:t xml:space="preserve">Sekarang</w:t>
-            </w:r>
-            <w:r>
-              <w:rPr>
-                <w:sz w:val="19"/>
-                <w:szCs w:val="19"/>
-              </w:rPr>
-              <w:t xml:space="preserve">, atau </w:t>
-            </w:r>
-            <w:r>
-              <w:rPr>
-                <w:b/>
-                <w:bCs/>
-                <w:sz w:val="19"/>
-                <w:szCs w:val="19"/>
-              </w:rPr>
-              <w:t xml:space="preserve">Jadwalkan</w:t>
-            </w:r>
-            <w:r>
-              <w:rPr>
-                <w:sz w:val="19"/>
-                <w:szCs w:val="19"/>
-              </w:rPr>
-              <w:t xml:space="preserve"> tanggal dan jam (paling jauh 7 hari ke depan; bawaan besok 07.00). Sebelum jamnya, siswa diberi tahu *baru dimulai pukul …*.</w:t>
+              <w:t xml:space="preserve">Mulai sekarang</w:t>
+            </w:r>
+            <w:r>
+              <w:rPr>
+                <w:sz w:val="19"/>
+                <w:szCs w:val="19"/>
+              </w:rPr>
+              <w:t xml:space="preserve"> (sesi tertutup = sekarang + lama pengerjaan + kelonggaran), atau </w:t>
+            </w:r>
+            <w:r>
+              <w:rPr>
+                <w:b/>
+                <w:bCs/>
+                <w:sz w:val="19"/>
+                <w:szCs w:val="19"/>
+              </w:rPr>
+              <w:t xml:space="preserve">Terjadwal</w:t>
+            </w:r>
+            <w:r>
+              <w:rPr>
+                <w:sz w:val="19"/>
+                <w:szCs w:val="19"/>
+              </w:rPr>
+              <w:t xml:space="preserve">: isi </w:t>
+            </w:r>
+            <w:r>
+              <w:rPr>
+                <w:b/>
+                <w:bCs/>
+                <w:sz w:val="19"/>
+                <w:szCs w:val="19"/>
+              </w:rPr>
+              <w:t xml:space="preserve">Bisa dibuka mulai</w:t>
+            </w:r>
+            <w:r>
+              <w:rPr>
+                <w:sz w:val="19"/>
+                <w:szCs w:val="19"/>
+              </w:rPr>
+              <w:t xml:space="preserve"> (paling jauh 7 hari ke depan; bawaan besok 07.00) dan </w:t>
+            </w:r>
+            <w:r>
+              <w:rPr>
+                <w:b/>
+                <w:bCs/>
+                <w:sz w:val="19"/>
+                <w:szCs w:val="19"/>
+              </w:rPr>
+              <w:t xml:space="preserve">Sampai</w:t>
+            </w:r>
+            <w:r>
+              <w:rPr>
+                <w:sz w:val="19"/>
+                <w:szCs w:val="19"/>
+              </w:rPr>
+              <w:t xml:space="preserve"> (paling lama 14 hari sesudah mulai), mis. latihan di rumah Senin 07.00 s.d. Jumat 15.00. Sebelum jamnya, siswa diberi tahu *baru dimulai pukul …*. Lama pengerjaan tetap berlaku untuk tiap siswa sejak ia masuk.</w:t>
             </w:r>
           </w:p>
         </w:tc>
@@ -9169,14 +9201,7 @@
                 <w:sz w:val="19"/>
                 <w:szCs w:val="19"/>
               </w:rPr>
-              <w:t xml:space="preserve">Lama pengerjaan</w:t>
-            </w:r>
-            <w:r>
-              <w:rPr>
-                <w:sz w:val="19"/>
-                <w:szCs w:val="19"/>
-              </w:rPr>
-              <w:t xml:space="preserve"> (menit)</w:t>
+              <w:t xml:space="preserve">Sesudah siswa mengumpulkan</w:t>
             </w:r>
           </w:p>
         </w:tc>
@@ -9196,10 +9221,51 @@
             </w:pPr>
             <w:r>
               <w:rPr>
-                <w:sz w:val="19"/>
-                <w:szCs w:val="19"/>
-              </w:rPr>
-              <w:t xml:space="preserve">Waktu untuk tiap siswa sejak ia masuk. Terisi dari durasi paket; 5–300 menit.</w:t>
+                <w:b/>
+                <w:bCs/>
+                <w:sz w:val="19"/>
+                <w:szCs w:val="19"/>
+              </w:rPr>
+              <w:t xml:space="preserve">Hanya nilai</w:t>
+            </w:r>
+            <w:r>
+              <w:rPr>
+                <w:sz w:val="19"/>
+                <w:szCs w:val="19"/>
+              </w:rPr>
+              <w:t xml:space="preserve"> (bawaan; siswa melihat nilai dan nomor benar/salah, cocok untuk asesmen di kelas) atau </w:t>
+            </w:r>
+            <w:r>
+              <w:rPr>
+                <w:b/>
+                <w:bCs/>
+                <w:sz w:val="19"/>
+                <w:szCs w:val="19"/>
+              </w:rPr>
+              <w:t xml:space="preserve">Nilai + kunci &amp; pembahasan</w:t>
+            </w:r>
+            <w:r>
+              <w:rPr>
+                <w:sz w:val="19"/>
+                <w:szCs w:val="19"/>
+              </w:rPr>
+              <w:t xml:space="preserve"> (cocok untuk latihan/belajar di rumah). Bisa diubah kapan saja lewat saklar </w:t>
+            </w:r>
+            <w:r>
+              <w:rPr>
+                <w:b/>
+                <w:bCs/>
+                <w:sz w:val="19"/>
+                <w:szCs w:val="19"/>
+              </w:rPr>
+              <w:t xml:space="preserve">Pembahasan</w:t>
+            </w:r>
+            <w:r>
+              <w:rPr>
+                <w:sz w:val="19"/>
+                <w:szCs w:val="19"/>
+              </w:rPr>
+              <w:t xml:space="preserve"> di kartu sesi; pilihan terakhir Anda diingat untuk sesi berikutnya.</w:t>
             </w:r>
           </w:p>
         </w:tc>
@@ -9230,7 +9296,7 @@
                 <w:sz w:val="19"/>
                 <w:szCs w:val="19"/>
               </w:rPr>
-              <w:t xml:space="preserve">Kelonggaran masuk</w:t>
+              <w:t xml:space="preserve">Lama pengerjaan</w:t>
             </w:r>
             <w:r>
               <w:rPr>
@@ -9261,6 +9327,66 @@
                 <w:sz w:val="19"/>
                 <w:szCs w:val="19"/>
               </w:rPr>
+              <w:t xml:space="preserve">Waktu untuk tiap siswa sejak ia masuk. Terisi dari durasi paket; 5–300 menit.</w:t>
+            </w:r>
+          </w:p>
+        </w:tc>
+      </w:tr>
+      <w:tr>
+        <w:trPr>
+          <w:cantSplit/>
+        </w:trPr>
+        <w:tc>
+          <w:tcPr>
+            <w:tcW w:type="dxa" w:w="2521"/>
+            <w:tcMar>
+              <w:top w:type="dxa" w:w="70"/>
+              <w:left w:type="dxa" w:w="110"/>
+              <w:bottom w:type="dxa" w:w="70"/>
+              <w:right w:type="dxa" w:w="110"/>
+            </w:tcMar>
+          </w:tcPr>
+          <w:p>
+            <w:pPr>
+              <w:spacing w:after="0"/>
+            </w:pPr>
+            <w:r>
+              <w:rPr>
+                <w:b/>
+                <w:bCs/>
+                <w:sz w:val="19"/>
+                <w:szCs w:val="19"/>
+              </w:rPr>
+              <w:t xml:space="preserve">Kelonggaran masuk</w:t>
+            </w:r>
+            <w:r>
+              <w:rPr>
+                <w:sz w:val="19"/>
+                <w:szCs w:val="19"/>
+              </w:rPr>
+              <w:t xml:space="preserve"> (menit)</w:t>
+            </w:r>
+          </w:p>
+        </w:tc>
+        <w:tc>
+          <w:tcPr>
+            <w:tcW w:type="dxa" w:w="7117"/>
+            <w:tcMar>
+              <w:top w:type="dxa" w:w="70"/>
+              <w:left w:type="dxa" w:w="110"/>
+              <w:bottom w:type="dxa" w:w="70"/>
+              <w:right w:type="dxa" w:w="110"/>
+            </w:tcMar>
+          </w:tcPr>
+          <w:p>
+            <w:pPr>
+              <w:spacing w:after="0"/>
+            </w:pPr>
+            <w:r>
+              <w:rPr>
+                <w:sz w:val="19"/>
+                <w:szCs w:val="19"/>
+              </w:rPr>
               <w:t xml:space="preserve">Tambahan waktu agar siswa yang terlambat masih bisa masuk. Bawaan 10 menit.</w:t>
             </w:r>
           </w:p>
@@ -9273,6 +9399,7 @@
         <w:tc>
           <w:tcPr>
             <w:tcW w:type="dxa" w:w="2521"/>
+            <w:shd w:fill="F6F8FB" w:color="auto" w:val="clear"/>
             <w:tcMar>
               <w:top w:type="dxa" w:w="70"/>
               <w:left w:type="dxa" w:w="110"/>
@@ -9298,23 +9425,24 @@
         <w:tc>
           <w:tcPr>
             <w:tcW w:type="dxa" w:w="7117"/>
-            <w:tcMar>
-              <w:top w:type="dxa" w:w="70"/>
-              <w:left w:type="dxa" w:w="110"/>
-              <w:bottom w:type="dxa" w:w="70"/>
-              <w:right w:type="dxa" w:w="110"/>
-            </w:tcMar>
-          </w:tcPr>
-          <w:p>
-            <w:pPr>
-              <w:spacing w:after="0"/>
-            </w:pPr>
-            <w:r>
-              <w:rPr>
-                <w:sz w:val="19"/>
-                <w:szCs w:val="19"/>
-              </w:rPr>
-              <w:t xml:space="preserve">Dihitung otomatis: jam mulai + lama pengerjaan + kelonggaran. Sesudahnya siswa tidak bisa masuk.</w:t>
+            <w:shd w:fill="F6F8FB" w:color="auto" w:val="clear"/>
+            <w:tcMar>
+              <w:top w:type="dxa" w:w="70"/>
+              <w:left w:type="dxa" w:w="110"/>
+              <w:bottom w:type="dxa" w:w="70"/>
+              <w:right w:type="dxa" w:w="110"/>
+            </w:tcMar>
+          </w:tcPr>
+          <w:p>
+            <w:pPr>
+              <w:spacing w:after="0"/>
+            </w:pPr>
+            <w:r>
+              <w:rPr>
+                <w:sz w:val="19"/>
+                <w:szCs w:val="19"/>
+              </w:rPr>
+              <w:t xml:space="preserve">Mulai sekarang: dihitung otomatis (sekarang + lama pengerjaan + kelonggaran). Terjadwal: sama dengan isian Sampai. Sesudahnya siswa tidak bisa masuk.</w:t>
             </w:r>
           </w:p>
         </w:tc>

</xml_diff>

<commit_message>
Ganti "Menu guru" menjadi "Menu utama" di semua halaman & panduan
Co-Authored-By: Claude Opus 5.5 <noreply@anthropic.com>
</commit_message>
<xml_diff>
--- a/Panduan_Guru_Asesmen_Merdeka.docx
+++ b/Panduan_Guru_Asesmen_Merdeka.docx
@@ -985,7 +985,7 @@
           <w:b/>
           <w:bCs/>
         </w:rPr>
-        <w:t xml:space="preserve">Menu guru → Latihan / Tryout</w:t>
+        <w:t xml:space="preserve">Menu utama → Latihan / Tryout</w:t>
       </w:r>
       <w:r>
         <w:t xml:space="preserve">, pilih paket dan kelas peserta, </w:t>
@@ -3118,7 +3118,7 @@
           <w:b/>
           <w:bCs/>
         </w:rPr>
-        <w:t xml:space="preserve">Menu guru → Pustaka Paket</w:t>
+        <w:t xml:space="preserve">Menu utama → Pustaka Paket</w:t>
       </w:r>
       <w:r>
         <w:t xml:space="preserve">, lalu tekan </w:t>
@@ -6149,7 +6149,7 @@
           <w:b/>
           <w:bCs/>
         </w:rPr>
-        <w:t xml:space="preserve">Menu guru → Pustaka Paket</w:t>
+        <w:t xml:space="preserve">Menu utama → Pustaka Paket</w:t>
       </w:r>
       <w:r>
         <w:t xml:space="preserve"> menampilkan satu baris untuk setiap kode ujian yang terlihat oleh Anda, dari kisi-kisi sampai hasil. Klik baris untuk membuka rinciannya. Tombol </w:t>
@@ -7254,7 +7254,7 @@
                 <w:sz w:val="19"/>
                 <w:szCs w:val="19"/>
               </w:rPr>
-              <w:t xml:space="preserve">Membuka Menu guru → Buka sesi baru dengan paket ini terpilih.</w:t>
+              <w:t xml:space="preserve">Membuka Menu utama → Buka sesi baru dengan paket ini terpilih.</w:t>
             </w:r>
           </w:p>
         </w:tc>
@@ -8625,7 +8625,7 @@
           <w:b/>
           <w:bCs/>
         </w:rPr>
-        <w:t xml:space="preserve">Menu guru → Latihan / Tryout</w:t>
+        <w:t xml:space="preserve">Menu utama → Latihan / Tryout</w:t>
       </w:r>
       <w:r>
         <w:t xml:space="preserve"> (dulu *Sesi Ujian*) menampilkan </w:t>
@@ -11807,7 +11807,7 @@
           <w:b/>
           <w:bCs/>
         </w:rPr>
-        <w:t xml:space="preserve">Menu guru → Dasbor Hasil</w:t>
+        <w:t xml:space="preserve">Menu utama → Dasbor Hasil</w:t>
       </w:r>
       <w:r>
         <w:t xml:space="preserve">. Dasbor membuka ujian yang terakhir Anda lihat di perangkat ini (atau yang dipilih dari Pustaka Paket / tombol Hasil di kartu sesi).</w:t>
@@ -14232,7 +14232,7 @@
           <w:b/>
           <w:bCs/>
         </w:rPr>
-        <w:t xml:space="preserve">Menu guru → NISN Siswa</w:t>
+        <w:t xml:space="preserve">Menu utama → NISN Siswa</w:t>
       </w:r>
       <w:r>
         <w:t xml:space="preserve"> membantu siswa yang lupa NISN. Guru melihat kelas yang diampunya menurut jadwal KBM; pengawas dan operator melihat semua kelas. Cari nama atau NISN, atau ketuk chip kelas; NISN tampil besar dengan tombol </w:t>

</xml_diff>

<commit_message>
Operator khusus Asesmen Bersama: tab Hasil Siswa (dasbor paket Folder Soal), tanpa Dasbor & Pustaka di menu operator
Co-Authored-By: Claude Opus 5.5 <noreply@anthropic.com>
</commit_message>
<xml_diff>
--- a/Panduan_Guru_Asesmen_Merdeka.docx
+++ b/Panduan_Guru_Asesmen_Merdeka.docx
@@ -1635,7 +1635,7 @@
                 <w:sz w:val="19"/>
                 <w:szCs w:val="19"/>
               </w:rPr>
-              <w:t xml:space="preserve">Menu </w:t>
+              <w:t xml:space="preserve">Khusus mengelola Asesmen Bersama. Menu </w:t>
             </w:r>
             <w:r>
               <w:rPr>
@@ -1651,6 +1651,38 @@
                 <w:sz w:val="19"/>
                 <w:szCs w:val="19"/>
               </w:rPr>
+              <w:t xml:space="preserve"> (termasuk tab </w:t>
+            </w:r>
+            <w:r>
+              <w:rPr>
+                <w:b/>
+                <w:bCs/>
+                <w:sz w:val="19"/>
+                <w:szCs w:val="19"/>
+              </w:rPr>
+              <w:t xml:space="preserve">Hasil Siswa</w:t>
+            </w:r>
+            <w:r>
+              <w:rPr>
+                <w:sz w:val="19"/>
+                <w:szCs w:val="19"/>
+              </w:rPr>
+              <w:t xml:space="preserve">), </w:t>
+            </w:r>
+            <w:r>
+              <w:rPr>
+                <w:b/>
+                <w:bCs/>
+                <w:sz w:val="19"/>
+                <w:szCs w:val="19"/>
+              </w:rPr>
+              <w:t xml:space="preserve">Kontrol Pelaksanaan</w:t>
+            </w:r>
+            <w:r>
+              <w:rPr>
+                <w:sz w:val="19"/>
+                <w:szCs w:val="19"/>
+              </w:rPr>
               <w:t xml:space="preserve">, </w:t>
             </w:r>
             <w:r>
@@ -1660,7 +1692,7 @@
                 <w:sz w:val="19"/>
                 <w:szCs w:val="19"/>
               </w:rPr>
-              <w:t xml:space="preserve">Kontrol Pelaksanaan</w:t>
+              <w:t xml:space="preserve">NISN Siswa</w:t>
             </w:r>
             <w:r>
               <w:rPr>
@@ -1676,38 +1708,6 @@
                 <w:sz w:val="19"/>
                 <w:szCs w:val="19"/>
               </w:rPr>
-              <w:t xml:space="preserve">Dasbor Hasil</w:t>
-            </w:r>
-            <w:r>
-              <w:rPr>
-                <w:sz w:val="19"/>
-                <w:szCs w:val="19"/>
-              </w:rPr>
-              <w:t xml:space="preserve">, </w:t>
-            </w:r>
-            <w:r>
-              <w:rPr>
-                <w:b/>
-                <w:bCs/>
-                <w:sz w:val="19"/>
-                <w:szCs w:val="19"/>
-              </w:rPr>
-              <w:t xml:space="preserve">NISN Siswa</w:t>
-            </w:r>
-            <w:r>
-              <w:rPr>
-                <w:sz w:val="19"/>
-                <w:szCs w:val="19"/>
-              </w:rPr>
-              <w:t xml:space="preserve">, </w:t>
-            </w:r>
-            <w:r>
-              <w:rPr>
-                <w:b/>
-                <w:bCs/>
-                <w:sz w:val="19"/>
-                <w:szCs w:val="19"/>
-              </w:rPr>
               <w:t xml:space="preserve">Admin</w:t>
             </w:r>
             <w:r>
@@ -1715,7 +1715,7 @@
                 <w:sz w:val="19"/>
                 <w:szCs w:val="19"/>
               </w:rPr>
-              <w:t xml:space="preserve"> (data siswa, PIN guru, pustaka paket semua guru, cadangan, arsip semester).</w:t>
+              <w:t xml:space="preserve"> (data siswa, PIN guru, cadangan, arsip semester).</w:t>
             </w:r>
           </w:p>
         </w:tc>
@@ -2073,7 +2073,7 @@
                 <w:sz w:val="19"/>
                 <w:szCs w:val="19"/>
               </w:rPr>
-              <w:t xml:space="preserve">guru, operator</w:t>
+              <w:t xml:space="preserve">guru</w:t>
             </w:r>
           </w:p>
         </w:tc>
@@ -2297,7 +2297,23 @@
                 <w:sz w:val="19"/>
                 <w:szCs w:val="19"/>
               </w:rPr>
-              <w:t xml:space="preserve">Ujian bersama (PAS, tryout bersama): peserta per ruang, jadwal, folder soal, terbitkan, cetak.</w:t>
+              <w:t xml:space="preserve">Ujian bersama (PAS, tryout bersama): peserta per ruang, jadwal, folder soal, </w:t>
+            </w:r>
+            <w:r>
+              <w:rPr>
+                <w:b/>
+                <w:bCs/>
+                <w:sz w:val="19"/>
+                <w:szCs w:val="19"/>
+              </w:rPr>
+              <w:t xml:space="preserve">hasil siswa</w:t>
+            </w:r>
+            <w:r>
+              <w:rPr>
+                <w:sz w:val="19"/>
+                <w:szCs w:val="19"/>
+              </w:rPr>
+              <w:t xml:space="preserve"> (dasbor hasil khusus paket di folder soal), terbitkan, cetak.</w:t>
             </w:r>
           </w:p>
         </w:tc>
@@ -2452,7 +2468,7 @@
                 <w:sz w:val="19"/>
                 <w:szCs w:val="19"/>
               </w:rPr>
-              <w:t xml:space="preserve">Data siswa, PIN guru, pustaka paket, impor kode hasil, cadangan, arsip semester.</w:t>
+              <w:t xml:space="preserve">Data siswa, PIN guru, impor kode hasil, cadangan, arsip semester.</w:t>
             </w:r>
           </w:p>
         </w:tc>
@@ -6368,7 +6384,7 @@
                 <w:sz w:val="19"/>
                 <w:szCs w:val="19"/>
               </w:rPr>
-              <w:t xml:space="preserve">Semua paket (lewat Admin → Pustaka Paket). Pengawas tidak memakai Pustaka Paket.</w:t>
+              <w:t xml:space="preserve">Tidak memakai Pustaka Paket; paket untuk asesmen bersama dipilih di Asesmen Bersama → Folder Soal. Pengawas juga tidak memakai Pustaka Paket.</w:t>
             </w:r>
           </w:p>
         </w:tc>

</xml_diff>

<commit_message>
Dasbor Hasil: tab Rekapitulasi (ringkasan per kelas + grafik); layar kode akses muat di layar + tombol Tutup
Co-Authored-By: Claude Opus 5.5 <noreply@anthropic.com>
</commit_message>
<xml_diff>
--- a/Panduan_Guru_Asesmen_Merdeka.docx
+++ b/Panduan_Guru_Asesmen_Merdeka.docx
@@ -645,7 +645,7 @@
           <w:bCs w:val="false"/>
           <w:color w:val="33445A"/>
         </w:rPr>
-        <w:t xml:space="preserve">5.4 Tab Rekap siswa</w:t>
+        <w:t xml:space="preserve">5.4 Tab Rekapitulasi</w:t>
       </w:r>
     </w:p>
     <w:p>
@@ -659,7 +659,7 @@
           <w:bCs w:val="false"/>
           <w:color w:val="33445A"/>
         </w:rPr>
-        <w:t xml:space="preserve">5.5 Tab Analisis butir</w:t>
+        <w:t xml:space="preserve">5.5 Tab Rekap siswa</w:t>
       </w:r>
     </w:p>
     <w:p>
@@ -673,7 +673,7 @@
           <w:bCs w:val="false"/>
           <w:color w:val="33445A"/>
         </w:rPr>
-        <w:t xml:space="preserve">5.6 Tab Sub-materi</w:t>
+        <w:t xml:space="preserve">5.6 Tab Analisis butir</w:t>
       </w:r>
     </w:p>
     <w:p>
@@ -687,7 +687,7 @@
           <w:bCs w:val="false"/>
           <w:color w:val="33445A"/>
         </w:rPr>
-        <w:t xml:space="preserve">5.7 Tab Belum mengerjakan dan Riwayat siswa</w:t>
+        <w:t xml:space="preserve">5.7 Tab Sub-materi</w:t>
       </w:r>
     </w:p>
     <w:p>
@@ -701,7 +701,7 @@
           <w:bCs w:val="false"/>
           <w:color w:val="33445A"/>
         </w:rPr>
-        <w:t xml:space="preserve">5.8 Unduh rekap (Excel)</w:t>
+        <w:t xml:space="preserve">5.8 Tab Belum mengerjakan dan Riwayat siswa</w:t>
       </w:r>
     </w:p>
     <w:p>
@@ -715,7 +715,7 @@
           <w:bCs w:val="false"/>
           <w:color w:val="33445A"/>
         </w:rPr>
-        <w:t xml:space="preserve">5.9 Reset dan hapus hasil</w:t>
+        <w:t xml:space="preserve">5.9 Unduh rekap (Excel)</w:t>
       </w:r>
     </w:p>
     <w:p>
@@ -729,7 +729,21 @@
           <w:bCs w:val="false"/>
           <w:color w:val="33445A"/>
         </w:rPr>
-        <w:t xml:space="preserve">5.10 NISN Siswa</w:t>
+        <w:t xml:space="preserve">5.10 Reset dan hapus hasil</w:t>
+      </w:r>
+    </w:p>
+    <w:p>
+      <w:pPr>
+        <w:spacing w:after="50" w:before="0"/>
+        <w:ind w:left="360"/>
+      </w:pPr>
+      <w:r>
+        <w:rPr>
+          <w:b w:val="false"/>
+          <w:bCs w:val="false"/>
+          <w:color w:val="33445A"/>
+        </w:rPr>
+        <w:t xml:space="preserve">5.11 NISN Siswa</w:t>
       </w:r>
     </w:p>
     <w:p>
@@ -2049,7 +2063,7 @@
                 <w:sz w:val="19"/>
                 <w:szCs w:val="19"/>
               </w:rPr>
-              <w:t xml:space="preserve">Rekap nilai, analisis butir, sub-materi, belum mengerjakan, riwayat siswa, unduh Excel.</w:t>
+              <w:t xml:space="preserve">Rekapitulasi per kelas &amp; grafik, rekap nilai, analisis butir, sub-materi, belum mengerjakan, riwayat siswa, unduh Excel.</w:t>
             </w:r>
           </w:p>
         </w:tc>
@@ -12016,7 +12030,7 @@
         <w:t xml:space="preserve">Kelas</w:t>
       </w:r>
       <w:r>
-        <w:t xml:space="preserve"> berlaku untuk tab Rekap, Analisis butir, Sub-materi, dan unduhan Excel. Enam kotak ringkasan dihitung dari baris yang lolos saringan:</w:t>
+        <w:t xml:space="preserve"> berlaku untuk tab Rekapitulasi, Rekap, Analisis butir, Sub-materi, dan unduhan Excel. Enam kotak ringkasan dihitung dari baris yang lolos saringan:</w:t>
       </w:r>
     </w:p>
     <w:tbl>
@@ -12413,7 +12427,53 @@
         <w:pStyle w:val="Heading2"/>
       </w:pPr>
       <w:r>
-        <w:t xml:space="preserve">5.4 Tab Rekap siswa</w:t>
+        <w:t xml:space="preserve">5.4 Tab Rekapitulasi</w:t>
+      </w:r>
+    </w:p>
+    <w:p>
+      <w:pPr>
+        <w:spacing w:after="120"/>
+      </w:pPr>
+      <w:r>
+        <w:t xml:space="preserve">Tab pertama, untuk membaca hasil sekilas. </w:t>
+      </w:r>
+      <w:r>
+        <w:rPr>
+          <w:b/>
+          <w:bCs/>
+        </w:rPr>
+        <w:t xml:space="preserve">Ringkasan per kelas</w:t>
+      </w:r>
+      <w:r>
+        <w:t xml:space="preserve">: jumlah siswa, rata-rata, tertinggi, terendah, dan tuntas (≥ 75) tiap kelas, ditambah baris *Semua kelas*. </w:t>
+      </w:r>
+      <w:r>
+        <w:rPr>
+          <w:b/>
+          <w:bCs/>
+        </w:rPr>
+        <w:t xml:space="preserve">Sebaran nilai</w:t>
+      </w:r>
+      <w:r>
+        <w:t xml:space="preserve">: banyak siswa per rentang 5 poin; batang merah &lt; 60, emas 60–74, hijau ≥ 75, dengan garis KKM 75. </w:t>
+      </w:r>
+      <w:r>
+        <w:rPr>
+          <w:b/>
+          <w:bCs/>
+        </w:rPr>
+        <w:t xml:space="preserve">Rata-rata, tertinggi, terendah per kelas</w:t>
+      </w:r>
+      <w:r>
+        <w:t xml:space="preserve">: garis dari nilai terendah ke tertinggi dengan titik gelap di rata-rata, sehingga kelas yang perlu perhatian langsung terlihat. Arahkan kursor (atau ketuk) batang/baris untuk melihat angkanya.</w:t>
+      </w:r>
+    </w:p>
+    <w:p>
+      <w:pPr>
+        <w:pStyle w:val="Heading2"/>
+      </w:pPr>
+      <w:r>
+        <w:t xml:space="preserve">5.5 Tab Rekap siswa</w:t>
       </w:r>
     </w:p>
     <w:tbl>
@@ -13046,7 +13106,7 @@
         <w:pStyle w:val="Heading2"/>
       </w:pPr>
       <w:r>
-        <w:t xml:space="preserve">5.5 Tab Analisis butir</w:t>
+        <w:t xml:space="preserve">5.6 Tab Analisis butir</w:t>
       </w:r>
     </w:p>
     <w:tbl>
@@ -13499,7 +13559,7 @@
         <w:pStyle w:val="Heading2"/>
       </w:pPr>
       <w:r>
-        <w:t xml:space="preserve">5.6 Tab Sub-materi</w:t>
+        <w:t xml:space="preserve">5.7 Tab Sub-materi</w:t>
       </w:r>
     </w:p>
     <w:p>
@@ -13545,7 +13605,7 @@
         <w:pStyle w:val="Heading2"/>
       </w:pPr>
       <w:r>
-        <w:t xml:space="preserve">5.7 Tab Belum mengerjakan dan Riwayat siswa</w:t>
+        <w:t xml:space="preserve">5.8 Tab Belum mengerjakan dan Riwayat siswa</w:t>
       </w:r>
     </w:p>
     <w:p>
@@ -13613,7 +13673,7 @@
         <w:pStyle w:val="Heading2"/>
       </w:pPr>
       <w:r>
-        <w:t xml:space="preserve">5.8 Unduh rekap (Excel)</w:t>
+        <w:t xml:space="preserve">5.9 Unduh rekap (Excel)</w:t>
       </w:r>
     </w:p>
     <w:p>
@@ -13947,7 +14007,7 @@
         <w:pStyle w:val="Heading2"/>
       </w:pPr>
       <w:r>
-        <w:t xml:space="preserve">5.9 Reset dan hapus hasil</w:t>
+        <w:t xml:space="preserve">5.10 Reset dan hapus hasil</w:t>
       </w:r>
     </w:p>
     <w:tbl>
@@ -14236,7 +14296,7 @@
         <w:pStyle w:val="Heading2"/>
       </w:pPr>
       <w:r>
-        <w:t xml:space="preserve">5.10 NISN Siswa</w:t>
+        <w:t xml:space="preserve">5.11 NISN Siswa</w:t>
       </w:r>
     </w:p>
     <w:p>

</xml_diff>

<commit_message>
Panduan Asesmen Bersama (operator & pengawas) dan gambar soal dikecilkan saat unggah
- alat/isi-panduan-pas.js + buat-panduan.js --pas: Panduan_Asesmen_Bersama.pdf/.docx
  (persiapan, hari H, pantau, susulan, tugas pengawas, hasil uji e2e & uji beban)
- Tombol Panduan di Asesmen Bersama & Kontrol Pelaksanaan; tautan di menu Panduan guru
- admin.html: gambar > 120 KB / 1200 px dikecilkan (sebelumnya 450 KB / 1600 px);
  uji beban PAS: gambar besar membuat soal serentak tampil 5-10 dtk

Co-Authored-By: Claude Opus 5.5 <noreply@anthropic.com>
</commit_message>
<xml_diff>
--- a/Panduan_Guru_Asesmen_Merdeka.docx
+++ b/Panduan_Guru_Asesmen_Merdeka.docx
@@ -5386,7 +5386,17 @@
         <w:t xml:space="preserve">Gambar</w:t>
       </w:r>
       <w:r>
-        <w:t xml:space="preserve"> PNG/JPG (juga GIF, BMP, WEBP, SVG). EMF/WMF ditolak — simpan ulang sebagai PNG. Usahakan tiap gambar &lt; 450 KB dan seluruh paket &lt; 4 MB agar ringan di HP siswa.</w:t>
+        <w:t xml:space="preserve"> PNG/JPG (juga GIF, BMP, WEBP, SVG). EMF/WMF ditolak — simpan ulang sebagai PNG. Saat unggah, gambar yang lebih besar dari 120 KB atau lebih lebar dari 1200 piksel </w:t>
+      </w:r>
+      <w:r>
+        <w:rPr>
+          <w:b/>
+          <w:bCs/>
+        </w:rPr>
+        <w:t xml:space="preserve">dikecilkan otomatis</w:t>
+      </w:r>
+      <w:r>
+        <w:t xml:space="preserve"> (tulisan di gambar tetap terbaca); peringatan muncul bila sesudahnya masih &gt; 250 KB. Usahakan seluruh paket &lt; 1 MB agar soal cepat tampil di HP siswa, terutama pada ujian serentak.</w:t>
       </w:r>
     </w:p>
     <w:p>
@@ -16188,6 +16198,87 @@
       <w:r>
         <w:t xml:space="preserve"> (lihat 3.6).</w:t>
       </w:r>
+    </w:p>
+    <w:tbl>
+      <w:tblPr>
+        <w:tblW w:type="dxa" w:w="9638"/>
+        <w:tblBorders>
+          <w:top w:val="none" w:color="FFFFFF" w:sz="0"/>
+          <w:left w:val="single" w:color="2F7FD8" w:sz="30"/>
+          <w:bottom w:val="none" w:color="FFFFFF" w:sz="0"/>
+          <w:right w:val="none" w:color="FFFFFF" w:sz="0"/>
+          <w:insideH w:val="none" w:color="FFFFFF" w:sz="0"/>
+          <w:insideV w:val="none" w:color="FFFFFF" w:sz="0"/>
+        </w:tblBorders>
+      </w:tblPr>
+      <w:tblGrid>
+        <w:gridCol w:w="9638"/>
+      </w:tblGrid>
+      <w:tr>
+        <w:trPr>
+          <w:cantSplit/>
+        </w:trPr>
+        <w:tc>
+          <w:tcPr>
+            <w:tcW w:type="dxa" w:w="9638"/>
+            <w:shd w:fill="E8F1FC" w:color="auto" w:val="clear"/>
+            <w:tcMar>
+              <w:top w:type="dxa" w:w="120"/>
+              <w:left w:type="dxa" w:w="200"/>
+              <w:bottom w:type="dxa" w:w="120"/>
+              <w:right w:type="dxa" w:w="160"/>
+            </w:tcMar>
+          </w:tcPr>
+          <w:p>
+            <w:pPr>
+              <w:spacing w:after="40"/>
+            </w:pPr>
+            <w:r>
+              <w:rPr>
+                <w:b/>
+                <w:bCs/>
+                <w:color w:val="2F7FD8"/>
+                <w:sz w:val="20"/>
+                <w:szCs w:val="20"/>
+              </w:rPr>
+              <w:t xml:space="preserve">Asesmen Bersama dan Kontrol Pelaksanaan</w:t>
+            </w:r>
+          </w:p>
+          <w:p>
+            <w:pPr>
+              <w:spacing w:after="40"/>
+            </w:pPr>
+            <w:r>
+              <w:rPr>
+                <w:sz w:val="19"/>
+                <w:szCs w:val="19"/>
+              </w:rPr>
+              <w:t xml:space="preserve">Menyiapkan PAS/tryout bersama (peserta per ruang, jadwal, Folder Soal, terbit, cetak, pantau, susulan) dan tugas pengawas ruang dijelaskan di </w:t>
+            </w:r>
+            <w:r>
+              <w:rPr>
+                <w:b/>
+                <w:bCs/>
+                <w:sz w:val="19"/>
+                <w:szCs w:val="19"/>
+              </w:rPr>
+              <w:t xml:space="preserve">Panduan Asesmen Bersama</w:t>
+            </w:r>
+            <w:r>
+              <w:rPr>
+                <w:sz w:val="19"/>
+                <w:szCs w:val="19"/>
+              </w:rPr>
+              <w:t xml:space="preserve"> (tombol 📘 Panduan di halaman Asesmen Bersama dan Kontrol Pelaksanaan).</w:t>
+            </w:r>
+          </w:p>
+        </w:tc>
+      </w:tr>
+    </w:tbl>
+    <w:p>
+      <w:pPr>
+        <w:spacing w:after="120"/>
+      </w:pPr>
     </w:p>
     <w:sectPr>
       <w:headerReference w:type="default" r:id="rId6"/>

</xml_diff>

<commit_message>
Pantau Kurikulum: halaman kurikulum.html + ubin di Menu utama
Paket & kisi-kisi (C1-C6/LOTS-MOTS-HOTS, tanggal unggah), sesi per kelas,
hasil & analisis butir, perkembangan kelas & siswa; panduan diperbarui.

Co-Authored-By: Claude Opus 5.5 <noreply@anthropic.com>
</commit_message>
<xml_diff>
--- a/Panduan_Guru_Asesmen_Merdeka.docx
+++ b/Panduan_Guru_Asesmen_Merdeka.docx
@@ -1755,10 +1755,12 @@
             </w:pPr>
             <w:r>
               <w:rPr>
-                <w:sz w:val="19"/>
-                <w:szCs w:val="19"/>
-              </w:rPr>
-              <w:t xml:space="preserve">PIN guru bersama (peralihan)</w:t>
+                <w:b/>
+                <w:bCs/>
+                <w:sz w:val="19"/>
+                <w:szCs w:val="19"/>
+              </w:rPr>
+              <w:t xml:space="preserve">PIN kurikulum</w:t>
             </w:r>
           </w:p>
         </w:tc>
@@ -1782,7 +1784,7 @@
                 <w:sz w:val="19"/>
                 <w:szCs w:val="19"/>
               </w:rPr>
-              <w:t xml:space="preserve">pil kuning PIN guru bersama</w:t>
+              <w:t xml:space="preserve">Kurikulum</w:t>
             </w:r>
           </w:p>
         </w:tc>
@@ -1790,6 +1792,96 @@
           <w:tcPr>
             <w:tcW w:type="dxa" w:w="5338"/>
             <w:shd w:fill="F6F8FB" w:color="auto" w:val="clear"/>
+            <w:tcMar>
+              <w:top w:type="dxa" w:w="70"/>
+              <w:left w:type="dxa" w:w="110"/>
+              <w:bottom w:type="dxa" w:w="70"/>
+              <w:right w:type="dxa" w:w="110"/>
+            </w:tcMar>
+          </w:tcPr>
+          <w:p>
+            <w:pPr>
+              <w:spacing w:after="0"/>
+            </w:pPr>
+            <w:r>
+              <w:rPr>
+                <w:sz w:val="19"/>
+                <w:szCs w:val="19"/>
+              </w:rPr>
+              <w:t xml:space="preserve">Hanya melihat: menu </w:t>
+            </w:r>
+            <w:r>
+              <w:rPr>
+                <w:b/>
+                <w:bCs/>
+                <w:sz w:val="19"/>
+                <w:szCs w:val="19"/>
+              </w:rPr>
+              <w:t xml:space="preserve">Pantau Kurikulum</w:t>
+            </w:r>
+            <w:r>
+              <w:rPr>
+                <w:sz w:val="19"/>
+                <w:szCs w:val="19"/>
+              </w:rPr>
+              <w:t xml:space="preserve"> (semua paket &amp; kisi-kisi dengan tingkat C1–C6/HOTS, sesi per kelas, hasil &amp; analisis butir, perkembangan siswa — semua guru dan kelas). Tidak bisa membuka sesi atau mengubah data.</w:t>
+            </w:r>
+          </w:p>
+        </w:tc>
+      </w:tr>
+      <w:tr>
+        <w:trPr>
+          <w:cantSplit/>
+        </w:trPr>
+        <w:tc>
+          <w:tcPr>
+            <w:tcW w:type="dxa" w:w="2521"/>
+            <w:tcMar>
+              <w:top w:type="dxa" w:w="70"/>
+              <w:left w:type="dxa" w:w="110"/>
+              <w:bottom w:type="dxa" w:w="70"/>
+              <w:right w:type="dxa" w:w="110"/>
+            </w:tcMar>
+          </w:tcPr>
+          <w:p>
+            <w:pPr>
+              <w:spacing w:after="0"/>
+            </w:pPr>
+            <w:r>
+              <w:rPr>
+                <w:sz w:val="19"/>
+                <w:szCs w:val="19"/>
+              </w:rPr>
+              <w:t xml:space="preserve">PIN guru bersama (peralihan)</w:t>
+            </w:r>
+          </w:p>
+        </w:tc>
+        <w:tc>
+          <w:tcPr>
+            <w:tcW w:type="dxa" w:w="1779"/>
+            <w:tcMar>
+              <w:top w:type="dxa" w:w="70"/>
+              <w:left w:type="dxa" w:w="110"/>
+              <w:bottom w:type="dxa" w:w="70"/>
+              <w:right w:type="dxa" w:w="110"/>
+            </w:tcMar>
+          </w:tcPr>
+          <w:p>
+            <w:pPr>
+              <w:spacing w:after="0"/>
+            </w:pPr>
+            <w:r>
+              <w:rPr>
+                <w:sz w:val="19"/>
+                <w:szCs w:val="19"/>
+              </w:rPr>
+              <w:t xml:space="preserve">pil kuning PIN guru bersama</w:t>
+            </w:r>
+          </w:p>
+        </w:tc>
+        <w:tc>
+          <w:tcPr>
+            <w:tcW w:type="dxa" w:w="5338"/>
             <w:tcMar>
               <w:top w:type="dxa" w:w="70"/>
               <w:left w:type="dxa" w:w="110"/>
@@ -2459,6 +2551,83 @@
                 <w:sz w:val="19"/>
                 <w:szCs w:val="19"/>
               </w:rPr>
+              <w:t xml:space="preserve">Pantau Kurikulum</w:t>
+            </w:r>
+          </w:p>
+        </w:tc>
+        <w:tc>
+          <w:tcPr>
+            <w:tcW w:type="dxa" w:w="5257"/>
+            <w:tcMar>
+              <w:top w:type="dxa" w:w="70"/>
+              <w:left w:type="dxa" w:w="110"/>
+              <w:bottom w:type="dxa" w:w="70"/>
+              <w:right w:type="dxa" w:w="110"/>
+            </w:tcMar>
+          </w:tcPr>
+          <w:p>
+            <w:pPr>
+              <w:spacing w:after="0"/>
+            </w:pPr>
+            <w:r>
+              <w:rPr>
+                <w:sz w:val="19"/>
+                <w:szCs w:val="19"/>
+              </w:rPr>
+              <w:t xml:space="preserve">Pemantauan seluruh sekolah dengan grafik: paket soal per jenis &amp; tanggal unggah, komposisi LOTS/MOTS/HOTS dan C1–C6 dari kisi-kisi, sesi yang dibuka per kelas, sebaran nilai, analisis butir, sub-materi terlemah, perkembangan tiap kelas &amp; siswa.</w:t>
+            </w:r>
+          </w:p>
+        </w:tc>
+        <w:tc>
+          <w:tcPr>
+            <w:tcW w:type="dxa" w:w="2336"/>
+            <w:tcMar>
+              <w:top w:type="dxa" w:w="70"/>
+              <w:left w:type="dxa" w:w="110"/>
+              <w:bottom w:type="dxa" w:w="70"/>
+              <w:right w:type="dxa" w:w="110"/>
+            </w:tcMar>
+          </w:tcPr>
+          <w:p>
+            <w:pPr>
+              <w:spacing w:after="0"/>
+            </w:pPr>
+            <w:r>
+              <w:rPr>
+                <w:sz w:val="19"/>
+                <w:szCs w:val="19"/>
+              </w:rPr>
+              <w:t xml:space="preserve">kurikulum, operator</w:t>
+            </w:r>
+          </w:p>
+        </w:tc>
+      </w:tr>
+      <w:tr>
+        <w:trPr>
+          <w:cantSplit/>
+        </w:trPr>
+        <w:tc>
+          <w:tcPr>
+            <w:tcW w:type="dxa" w:w="2044"/>
+            <w:shd w:fill="F6F8FB" w:color="auto" w:val="clear"/>
+            <w:tcMar>
+              <w:top w:type="dxa" w:w="70"/>
+              <w:left w:type="dxa" w:w="110"/>
+              <w:bottom w:type="dxa" w:w="70"/>
+              <w:right w:type="dxa" w:w="110"/>
+            </w:tcMar>
+          </w:tcPr>
+          <w:p>
+            <w:pPr>
+              <w:spacing w:after="0"/>
+            </w:pPr>
+            <w:r>
+              <w:rPr>
+                <w:b/>
+                <w:bCs/>
+                <w:sz w:val="19"/>
+                <w:szCs w:val="19"/>
+              </w:rPr>
               <w:t xml:space="preserve">Admin</w:t>
             </w:r>
           </w:p>
@@ -2466,6 +2635,7 @@
         <w:tc>
           <w:tcPr>
             <w:tcW w:type="dxa" w:w="5257"/>
+            <w:shd w:fill="F6F8FB" w:color="auto" w:val="clear"/>
             <w:tcMar>
               <w:top w:type="dxa" w:w="70"/>
               <w:left w:type="dxa" w:w="110"/>
@@ -2489,6 +2659,7 @@
         <w:tc>
           <w:tcPr>
             <w:tcW w:type="dxa" w:w="2336"/>
+            <w:shd w:fill="F6F8FB" w:color="auto" w:val="clear"/>
             <w:tcMar>
               <w:top w:type="dxa" w:w="70"/>
               <w:left w:type="dxa" w:w="110"/>

</xml_diff>

<commit_message>
Pantau Kurikulum: tab Analisis Mapel (per mapel & per guru); PIN kurikulum langsung ke halaman
Co-Authored-By: Claude Opus 5.5 <noreply@anthropic.com>
</commit_message>
<xml_diff>
--- a/Panduan_Guru_Asesmen_Merdeka.docx
+++ b/Panduan_Guru_Asesmen_Merdeka.docx
@@ -2574,7 +2574,23 @@
                 <w:sz w:val="19"/>
                 <w:szCs w:val="19"/>
               </w:rPr>
-              <w:t xml:space="preserve">Pemantauan seluruh sekolah dengan grafik: paket soal per jenis &amp; tanggal unggah, komposisi LOTS/MOTS/HOTS dan C1–C6 dari kisi-kisi, sesi yang dibuka per kelas, sebaran nilai, analisis butir, sub-materi terlemah, perkembangan tiap kelas &amp; siswa.</w:t>
+              <w:t xml:space="preserve">Pemantauan seluruh sekolah dengan grafik (PIN kurikulum langsung masuk ke halaman ini). Tab </w:t>
+            </w:r>
+            <w:r>
+              <w:rPr>
+                <w:b/>
+                <w:bCs/>
+                <w:sz w:val="19"/>
+                <w:szCs w:val="19"/>
+              </w:rPr>
+              <w:t xml:space="preserve">Analisis Mapel</w:t>
+            </w:r>
+            <w:r>
+              <w:rPr>
+                <w:sz w:val="19"/>
+                <w:szCs w:val="19"/>
+              </w:rPr>
+              <w:t xml:space="preserve">: per mapel &amp; per guru — kelas yang diajar vs sudah diuji, rata-rata kelas tiap guru, perkembangan hasil belajar, kualitas soal (HOTS). Tab lain: paket soal per jenis &amp; tanggal unggah, komposisi LOTS/MOTS/HOTS dan C1–C6 dari kisi-kisi, sesi yang dibuka per kelas, sebaran nilai, analisis butir, sub-materi terlemah, perkembangan tiap kelas &amp; siswa.</w:t>
             </w:r>
           </w:p>
         </w:tc>

</xml_diff>

<commit_message>
Pantau Kurikulum: tab Keterlaksanaan Asesmen (status guru, peta kegiatan, tindak lanjut)
Co-Authored-By: Claude Opus 5.5 <noreply@anthropic.com>
</commit_message>
<xml_diff>
--- a/Panduan_Guru_Asesmen_Merdeka.docx
+++ b/Panduan_Guru_Asesmen_Merdeka.docx
@@ -2575,6 +2575,22 @@
                 <w:szCs w:val="19"/>
               </w:rPr>
               <w:t xml:space="preserve">Pemantauan seluruh sekolah dengan grafik (PIN kurikulum langsung masuk ke halaman ini). Tab </w:t>
+            </w:r>
+            <w:r>
+              <w:rPr>
+                <w:b/>
+                <w:bCs/>
+                <w:sz w:val="19"/>
+                <w:szCs w:val="19"/>
+              </w:rPr>
+              <w:t xml:space="preserve">Keterlaksanaan</w:t>
+            </w:r>
+            <w:r>
+              <w:rPr>
+                <w:sz w:val="19"/>
+                <w:szCs w:val="19"/>
+              </w:rPr>
+              <w:t xml:space="preserve">: status tiap guru (aktif / perlu didorong / belum mulai), peta kegiatan mingguan, dan daftar tindak lanjut. Tab </w:t>
             </w:r>
             <w:r>
               <w:rPr>

</xml_diff>

<commit_message>
Halaman TO TKA untuk koordinator (jadwal, soal guru, sesi & link CBT, rekap per periode)
PIN koordinator langsung ke to-tka.html; ubin TO TKA untuk operator; tautan
hanya-lihat dari Pantau Kurikulum; panduan diperbarui.

Co-Authored-By: Claude Opus 5.5 <noreply@anthropic.com>
</commit_message>
<xml_diff>
--- a/Panduan_Guru_Asesmen_Merdeka.docx
+++ b/Panduan_Guru_Asesmen_Merdeka.docx
@@ -1849,6 +1849,99 @@
             </w:pPr>
             <w:r>
               <w:rPr>
+                <w:b/>
+                <w:bCs/>
+                <w:sz w:val="19"/>
+                <w:szCs w:val="19"/>
+              </w:rPr>
+              <w:t xml:space="preserve">PIN koordinator TO TKA</w:t>
+            </w:r>
+          </w:p>
+        </w:tc>
+        <w:tc>
+          <w:tcPr>
+            <w:tcW w:type="dxa" w:w="1779"/>
+            <w:tcMar>
+              <w:top w:type="dxa" w:w="70"/>
+              <w:left w:type="dxa" w:w="110"/>
+              <w:bottom w:type="dxa" w:w="70"/>
+              <w:right w:type="dxa" w:w="110"/>
+            </w:tcMar>
+          </w:tcPr>
+          <w:p>
+            <w:pPr>
+              <w:spacing w:after="0"/>
+            </w:pPr>
+            <w:r>
+              <w:rPr>
+                <w:sz w:val="19"/>
+                <w:szCs w:val="19"/>
+              </w:rPr>
+              <w:t xml:space="preserve">Koordinator TO</w:t>
+            </w:r>
+          </w:p>
+        </w:tc>
+        <w:tc>
+          <w:tcPr>
+            <w:tcW w:type="dxa" w:w="5338"/>
+            <w:tcMar>
+              <w:top w:type="dxa" w:w="70"/>
+              <w:left w:type="dxa" w:w="110"/>
+              <w:bottom w:type="dxa" w:w="70"/>
+              <w:right w:type="dxa" w:w="110"/>
+            </w:tcMar>
+          </w:tcPr>
+          <w:p>
+            <w:pPr>
+              <w:spacing w:after="0"/>
+            </w:pPr>
+            <w:r>
+              <w:rPr>
+                <w:sz w:val="19"/>
+                <w:szCs w:val="19"/>
+              </w:rPr>
+              <w:t xml:space="preserve">Langsung ke halaman </w:t>
+            </w:r>
+            <w:r>
+              <w:rPr>
+                <w:b/>
+                <w:bCs/>
+                <w:sz w:val="19"/>
+                <w:szCs w:val="19"/>
+              </w:rPr>
+              <w:t xml:space="preserve">TO TKA</w:t>
+            </w:r>
+            <w:r>
+              <w:rPr>
+                <w:sz w:val="19"/>
+                <w:szCs w:val="19"/>
+              </w:rPr>
+              <w:t xml:space="preserve">: jadwal TO Mapel Wajib &amp; Pilihan, soal dari guru (pasang paket ke jadwal), buka sesi + link CBT/QR/teks WA, rekap &amp; laporan per periode. Hanya untuk paket yang dipasang di jadwal TO; tidak bisa membuka menu lain.</w:t>
+            </w:r>
+          </w:p>
+        </w:tc>
+      </w:tr>
+      <w:tr>
+        <w:trPr>
+          <w:cantSplit/>
+        </w:trPr>
+        <w:tc>
+          <w:tcPr>
+            <w:tcW w:type="dxa" w:w="2521"/>
+            <w:shd w:fill="F6F8FB" w:color="auto" w:val="clear"/>
+            <w:tcMar>
+              <w:top w:type="dxa" w:w="70"/>
+              <w:left w:type="dxa" w:w="110"/>
+              <w:bottom w:type="dxa" w:w="70"/>
+              <w:right w:type="dxa" w:w="110"/>
+            </w:tcMar>
+          </w:tcPr>
+          <w:p>
+            <w:pPr>
+              <w:spacing w:after="0"/>
+            </w:pPr>
+            <w:r>
+              <w:rPr>
                 <w:sz w:val="19"/>
                 <w:szCs w:val="19"/>
               </w:rPr>
@@ -1859,6 +1952,7 @@
         <w:tc>
           <w:tcPr>
             <w:tcW w:type="dxa" w:w="1779"/>
+            <w:shd w:fill="F6F8FB" w:color="auto" w:val="clear"/>
             <w:tcMar>
               <w:top w:type="dxa" w:w="70"/>
               <w:left w:type="dxa" w:w="110"/>
@@ -1882,6 +1976,7 @@
         <w:tc>
           <w:tcPr>
             <w:tcW w:type="dxa" w:w="5338"/>
+            <w:shd w:fill="F6F8FB" w:color="auto" w:val="clear"/>
             <w:tcMar>
               <w:top w:type="dxa" w:w="70"/>
               <w:left w:type="dxa" w:w="110"/>
@@ -2660,7 +2755,7 @@
                 <w:sz w:val="19"/>
                 <w:szCs w:val="19"/>
               </w:rPr>
-              <w:t xml:space="preserve">Admin</w:t>
+              <w:t xml:space="preserve">TO TKA</w:t>
             </w:r>
           </w:p>
         </w:tc>
@@ -2684,7 +2779,7 @@
                 <w:sz w:val="19"/>
                 <w:szCs w:val="19"/>
               </w:rPr>
-              <w:t xml:space="preserve">Data siswa, PIN guru, impor kode hasil, cadangan, arsip semester.</w:t>
+              <w:t xml:space="preserve">Koordinator Tryout TKA: kalender TO Mapel Wajib (BI·MTK·BIng bergiliran) dan Mapel Pilihan kelas 11, status soal tiap guru (tenggat Jumat), buka sesi dan bagikan link CBT, rekap nilai &amp; laporan per periode (Excel dan cetak).</w:t>
             </w:r>
           </w:p>
         </w:tc>
@@ -2692,6 +2787,82 @@
           <w:tcPr>
             <w:tcW w:type="dxa" w:w="2336"/>
             <w:shd w:fill="F6F8FB" w:color="auto" w:val="clear"/>
+            <w:tcMar>
+              <w:top w:type="dxa" w:w="70"/>
+              <w:left w:type="dxa" w:w="110"/>
+              <w:bottom w:type="dxa" w:w="70"/>
+              <w:right w:type="dxa" w:w="110"/>
+            </w:tcMar>
+          </w:tcPr>
+          <w:p>
+            <w:pPr>
+              <w:spacing w:after="0"/>
+            </w:pPr>
+            <w:r>
+              <w:rPr>
+                <w:sz w:val="19"/>
+                <w:szCs w:val="19"/>
+              </w:rPr>
+              <w:t xml:space="preserve">koordinator, operator</w:t>
+            </w:r>
+          </w:p>
+        </w:tc>
+      </w:tr>
+      <w:tr>
+        <w:trPr>
+          <w:cantSplit/>
+        </w:trPr>
+        <w:tc>
+          <w:tcPr>
+            <w:tcW w:type="dxa" w:w="2044"/>
+            <w:tcMar>
+              <w:top w:type="dxa" w:w="70"/>
+              <w:left w:type="dxa" w:w="110"/>
+              <w:bottom w:type="dxa" w:w="70"/>
+              <w:right w:type="dxa" w:w="110"/>
+            </w:tcMar>
+          </w:tcPr>
+          <w:p>
+            <w:pPr>
+              <w:spacing w:after="0"/>
+            </w:pPr>
+            <w:r>
+              <w:rPr>
+                <w:b/>
+                <w:bCs/>
+                <w:sz w:val="19"/>
+                <w:szCs w:val="19"/>
+              </w:rPr>
+              <w:t xml:space="preserve">Admin</w:t>
+            </w:r>
+          </w:p>
+        </w:tc>
+        <w:tc>
+          <w:tcPr>
+            <w:tcW w:type="dxa" w:w="5257"/>
+            <w:tcMar>
+              <w:top w:type="dxa" w:w="70"/>
+              <w:left w:type="dxa" w:w="110"/>
+              <w:bottom w:type="dxa" w:w="70"/>
+              <w:right w:type="dxa" w:w="110"/>
+            </w:tcMar>
+          </w:tcPr>
+          <w:p>
+            <w:pPr>
+              <w:spacing w:after="0"/>
+            </w:pPr>
+            <w:r>
+              <w:rPr>
+                <w:sz w:val="19"/>
+                <w:szCs w:val="19"/>
+              </w:rPr>
+              <w:t xml:space="preserve">Data siswa, PIN guru, impor kode hasil, cadangan, arsip semester.</w:t>
+            </w:r>
+          </w:p>
+        </w:tc>
+        <w:tc>
+          <w:tcPr>
+            <w:tcW w:type="dxa" w:w="2336"/>
             <w:tcMar>
               <w:top w:type="dxa" w:w="70"/>
               <w:left w:type="dxa" w:w="110"/>

</xml_diff>

<commit_message>
Upload soal untuk koordinator TO TKA (atas nama guru penyusun, mapel TO)
admin.html: tab upload saja + bilah pilihan guru penyusun; to-tka.html: tombol + Unggah soal.

Co-Authored-By: Claude Opus 5.5 <noreply@anthropic.com>
</commit_message>
<xml_diff>
--- a/Panduan_Guru_Asesmen_Merdeka.docx
+++ b/Panduan_Guru_Asesmen_Merdeka.docx
@@ -1916,7 +1916,23 @@
                 <w:sz w:val="19"/>
                 <w:szCs w:val="19"/>
               </w:rPr>
-              <w:t xml:space="preserve">: jadwal TO Mapel Wajib &amp; Pilihan, soal dari guru (pasang paket ke jadwal), buka sesi + link CBT/QR/teks WA, rekap &amp; laporan per periode. Hanya untuk paket yang dipasang di jadwal TO; tidak bisa membuka menu lain.</w:t>
+              <w:t xml:space="preserve">: jadwal TO Mapel Wajib &amp; Pilihan, soal dari guru (pasang paket ke jadwal), buka sesi + link CBT/QR/teks WA, rekap &amp; laporan per periode. Hanya untuk paket yang dipasang di jadwal TO. Bisa </w:t>
+            </w:r>
+            <w:r>
+              <w:rPr>
+                <w:b/>
+                <w:bCs/>
+                <w:sz w:val="19"/>
+                <w:szCs w:val="19"/>
+              </w:rPr>
+              <w:t xml:space="preserve">unggah soal mapel TO atas nama guru penyusun</w:t>
+            </w:r>
+            <w:r>
+              <w:rPr>
+                <w:sz w:val="19"/>
+                <w:szCs w:val="19"/>
+              </w:rPr>
+              <w:t xml:space="preserve"> (tombol + Unggah soal → halaman Upload soal dengan bilah pilihan guru); tidak bisa membuka menu lain.</w:t>
             </w:r>
           </w:p>
         </w:tc>

</xml_diff>

<commit_message>
Prompt AI tanpa kisi-kisi: naskah Paket 1/Paket 2 jadi satu paket 2 varian; panduan
Co-Authored-By: Claude Opus 5.5 <noreply@anthropic.com>
</commit_message>
<xml_diff>
--- a/Panduan_Guru_Asesmen_Merdeka.docx
+++ b/Panduan_Guru_Asesmen_Merdeka.docx
@@ -6484,6 +6484,183 @@
       <w:r>
         <w:t xml:space="preserve">2.6 Upload tanpa kisi-kisi</w:t>
       </w:r>
+    </w:p>
+    <w:tbl>
+      <w:tblPr>
+        <w:tblW w:type="dxa" w:w="9638"/>
+        <w:tblBorders>
+          <w:top w:val="none" w:color="FFFFFF" w:sz="0"/>
+          <w:left w:val="single" w:color="2E9E5B" w:sz="30"/>
+          <w:bottom w:val="none" w:color="FFFFFF" w:sz="0"/>
+          <w:right w:val="none" w:color="FFFFFF" w:sz="0"/>
+          <w:insideH w:val="none" w:color="FFFFFF" w:sz="0"/>
+          <w:insideV w:val="none" w:color="FFFFFF" w:sz="0"/>
+        </w:tblBorders>
+      </w:tblPr>
+      <w:tblGrid>
+        <w:gridCol w:w="9638"/>
+      </w:tblGrid>
+      <w:tr>
+        <w:trPr>
+          <w:cantSplit/>
+        </w:trPr>
+        <w:tc>
+          <w:tcPr>
+            <w:tcW w:type="dxa" w:w="9638"/>
+            <w:shd w:fill="E7F5EC" w:color="auto" w:val="clear"/>
+            <w:tcMar>
+              <w:top w:type="dxa" w:w="120"/>
+              <w:left w:type="dxa" w:w="200"/>
+              <w:bottom w:type="dxa" w:w="120"/>
+              <w:right w:type="dxa" w:w="160"/>
+            </w:tcMar>
+          </w:tcPr>
+          <w:p>
+            <w:pPr>
+              <w:spacing w:after="40"/>
+            </w:pPr>
+            <w:r>
+              <w:rPr>
+                <w:b/>
+                <w:bCs/>
+                <w:color w:val="2E9E5B"/>
+                <w:sz w:val="20"/>
+                <w:szCs w:val="20"/>
+              </w:rPr>
+              <w:t xml:space="preserve">Naskah berisi Paket 1 dan Paket 2</w:t>
+            </w:r>
+          </w:p>
+          <w:p>
+            <w:pPr>
+              <w:spacing w:after="40"/>
+            </w:pPr>
+            <w:r>
+              <w:rPr>
+                <w:sz w:val="19"/>
+                <w:szCs w:val="19"/>
+              </w:rPr>
+              <w:t xml:space="preserve">Naskah yang memuat dua versi soal (judul </w:t>
+            </w:r>
+            <w:r>
+              <w:rPr>
+                <w:b/>
+                <w:bCs/>
+                <w:sz w:val="19"/>
+                <w:szCs w:val="19"/>
+              </w:rPr>
+              <w:t xml:space="preserve">Paket 1</w:t>
+            </w:r>
+            <w:r>
+              <w:rPr>
+                <w:sz w:val="19"/>
+                <w:szCs w:val="19"/>
+              </w:rPr>
+              <w:t xml:space="preserve"> dan </w:t>
+            </w:r>
+            <w:r>
+              <w:rPr>
+                <w:b/>
+                <w:bCs/>
+                <w:sz w:val="19"/>
+                <w:szCs w:val="19"/>
+              </w:rPr>
+              <w:t xml:space="preserve">Paket 2</w:t>
+            </w:r>
+            <w:r>
+              <w:rPr>
+                <w:sz w:val="19"/>
+                <w:szCs w:val="19"/>
+              </w:rPr>
+              <w:t xml:space="preserve">) diterbitkan sebagai </w:t>
+            </w:r>
+            <w:r>
+              <w:rPr>
+                <w:b/>
+                <w:bCs/>
+                <w:sz w:val="19"/>
+                <w:szCs w:val="19"/>
+              </w:rPr>
+              <w:t xml:space="preserve">satu paket dengan 2 varian</w:t>
+            </w:r>
+            <w:r>
+              <w:rPr>
+                <w:sz w:val="19"/>
+                <w:szCs w:val="19"/>
+              </w:rPr>
+              <w:t xml:space="preserve">: Paket 1 = Varian A, Paket 2 = Varian B, nomor soal sama (1–5), dan siswa mendapat salah satu varian secara acak. Cara termudah: tab </w:t>
+            </w:r>
+            <w:r>
+              <w:rPr>
+                <w:b/>
+                <w:bCs/>
+                <w:sz w:val="19"/>
+                <w:szCs w:val="19"/>
+              </w:rPr>
+              <w:t xml:space="preserve">Tanpa Kisi-kisi</w:t>
+            </w:r>
+            <w:r>
+              <w:rPr>
+                <w:sz w:val="19"/>
+                <w:szCs w:val="19"/>
+              </w:rPr>
+              <w:t xml:space="preserve"> → </w:t>
+            </w:r>
+            <w:r>
+              <w:rPr>
+                <w:b/>
+                <w:bCs/>
+                <w:sz w:val="19"/>
+                <w:szCs w:val="19"/>
+              </w:rPr>
+              <w:t xml:space="preserve">Unduh prompt AI</w:t>
+            </w:r>
+            <w:r>
+              <w:rPr>
+                <w:sz w:val="19"/>
+                <w:szCs w:val="19"/>
+              </w:rPr>
+              <w:t xml:space="preserve"> + </w:t>
+            </w:r>
+            <w:r>
+              <w:rPr>
+                <w:b/>
+                <w:bCs/>
+                <w:sz w:val="19"/>
+                <w:szCs w:val="19"/>
+              </w:rPr>
+              <w:t xml:space="preserve">Unduh template tanpa kisi-kisi</w:t>
+            </w:r>
+            <w:r>
+              <w:rPr>
+                <w:sz w:val="19"/>
+                <w:szCs w:val="19"/>
+              </w:rPr>
+              <w:t xml:space="preserve">, lampirkan keduanya bersama naskah ke ChatGPT, lalu tempel prompt. Syaratnya: jumlah soal kedua paket sama dan </w:t>
+            </w:r>
+            <w:r>
+              <w:rPr>
+                <w:b/>
+                <w:bCs/>
+                <w:sz w:val="19"/>
+                <w:szCs w:val="19"/>
+              </w:rPr>
+              <w:t xml:space="preserve">bentuk soal pada nomor yang sama harus sama</w:t>
+            </w:r>
+            <w:r>
+              <w:rPr>
+                <w:sz w:val="19"/>
+                <w:szCs w:val="19"/>
+              </w:rPr>
+              <w:t xml:space="preserve"> (mis. nomor 3 sama-sama PG Kompleks). MCMA ditulis sebagai PG Kompleks; tabel pernyataan Benar/Salah sebagai Benar - Salah.</w:t>
+            </w:r>
+          </w:p>
+        </w:tc>
+      </w:tr>
+    </w:tbl>
+    <w:p>
+      <w:pPr>
+        <w:spacing w:after="120"/>
+      </w:pPr>
     </w:p>
     <w:p>
       <w:pPr>

</xml_diff>

<commit_message>
Istilah Tryout Umum / Tryout Mandiri, menu Pantau Kurikulum 4 grup + tab, batal unggah kembali ke tab asal
Co-Authored-By: Claude Opus 5.5 <noreply@anthropic.com>
</commit_message>
<xml_diff>
--- a/Panduan_Guru_Asesmen_Merdeka.docx
+++ b/Panduan_Guru_Asesmen_Merdeka.docx
@@ -1854,7 +1854,7 @@
                 <w:sz w:val="19"/>
                 <w:szCs w:val="19"/>
               </w:rPr>
-              <w:t xml:space="preserve">PIN koordinator TO TKA</w:t>
+              <w:t xml:space="preserve">PIN koordinator Tryout Umum</w:t>
             </w:r>
           </w:p>
         </w:tc>
@@ -1877,7 +1877,7 @@
                 <w:sz w:val="19"/>
                 <w:szCs w:val="19"/>
               </w:rPr>
-              <w:t xml:space="preserve">Koordinator TO</w:t>
+              <w:t xml:space="preserve">Koordinator</w:t>
             </w:r>
           </w:p>
         </w:tc>
@@ -1909,7 +1909,7 @@
                 <w:sz w:val="19"/>
                 <w:szCs w:val="19"/>
               </w:rPr>
-              <w:t xml:space="preserve">TO TKA</w:t>
+              <w:t xml:space="preserve">Tryout Umum</w:t>
             </w:r>
             <w:r>
               <w:rPr>
@@ -2771,7 +2771,7 @@
                 <w:sz w:val="19"/>
                 <w:szCs w:val="19"/>
               </w:rPr>
-              <w:t xml:space="preserve">TO TKA</w:t>
+              <w:t xml:space="preserve">Tryout Umum</w:t>
             </w:r>
           </w:p>
         </w:tc>
@@ -2795,7 +2795,7 @@
                 <w:sz w:val="19"/>
                 <w:szCs w:val="19"/>
               </w:rPr>
-              <w:t xml:space="preserve">Koordinator Tryout TKA: kalender TO Mapel Wajib (BI·MTK·BIng bergiliran) dan Mapel Pilihan kelas 11, status soal tiap guru (tenggat Jumat), buka sesi dan bagikan link CBT, rekap nilai &amp; laporan per periode (Excel dan cetak).</w:t>
+              <w:t xml:space="preserve">Tryout yang diatur koordinator untuk banyak kelas: kalender TO Mapel Wajib (BI·MTK·BIng bergiliran) dan Mapel Pilihan kelas 11, status soal tiap guru (tenggat Jumat), buka sesi dan bagikan link CBT, rekap nilai &amp; laporan per periode (Excel dan cetak).</w:t>
             </w:r>
           </w:p>
         </w:tc>
@@ -9222,6 +9222,103 @@
       <w:r>
         <w:t xml:space="preserve">4. Latihan / Tryout</w:t>
       </w:r>
+    </w:p>
+    <w:tbl>
+      <w:tblPr>
+        <w:tblW w:type="dxa" w:w="9638"/>
+        <w:tblBorders>
+          <w:top w:val="none" w:color="FFFFFF" w:sz="0"/>
+          <w:left w:val="single" w:color="2F7FD8" w:sz="30"/>
+          <w:bottom w:val="none" w:color="FFFFFF" w:sz="0"/>
+          <w:right w:val="none" w:color="FFFFFF" w:sz="0"/>
+          <w:insideH w:val="none" w:color="FFFFFF" w:sz="0"/>
+          <w:insideV w:val="none" w:color="FFFFFF" w:sz="0"/>
+        </w:tblBorders>
+      </w:tblPr>
+      <w:tblGrid>
+        <w:gridCol w:w="9638"/>
+      </w:tblGrid>
+      <w:tr>
+        <w:trPr>
+          <w:cantSplit/>
+        </w:trPr>
+        <w:tc>
+          <w:tcPr>
+            <w:tcW w:type="dxa" w:w="9638"/>
+            <w:shd w:fill="E8F1FC" w:color="auto" w:val="clear"/>
+            <w:tcMar>
+              <w:top w:type="dxa" w:w="120"/>
+              <w:left w:type="dxa" w:w="200"/>
+              <w:bottom w:type="dxa" w:w="120"/>
+              <w:right w:type="dxa" w:w="160"/>
+            </w:tcMar>
+          </w:tcPr>
+          <w:p>
+            <w:pPr>
+              <w:spacing w:after="40"/>
+            </w:pPr>
+            <w:r>
+              <w:rPr>
+                <w:b/>
+                <w:bCs/>
+                <w:color w:val="2F7FD8"/>
+                <w:sz w:val="20"/>
+                <w:szCs w:val="20"/>
+              </w:rPr>
+              <w:t xml:space="preserve">Tryout Mandiri dan Tryout Umum</w:t>
+            </w:r>
+          </w:p>
+          <w:p>
+            <w:pPr>
+              <w:spacing w:after="40"/>
+            </w:pPr>
+            <w:r>
+              <w:rPr>
+                <w:sz w:val="19"/>
+                <w:szCs w:val="19"/>
+              </w:rPr>
+              <w:t xml:space="preserve">Sesi yang Anda buka dari menu ini adalah </w:t>
+            </w:r>
+            <w:r>
+              <w:rPr>
+                <w:b/>
+                <w:bCs/>
+                <w:sz w:val="19"/>
+                <w:szCs w:val="19"/>
+              </w:rPr>
+              <w:t xml:space="preserve">Tryout Mandiri</w:t>
+            </w:r>
+            <w:r>
+              <w:rPr>
+                <w:sz w:val="19"/>
+                <w:szCs w:val="19"/>
+              </w:rPr>
+              <w:t xml:space="preserve">: latihan atau tryout di kelas Anda sendiri. </w:t>
+            </w:r>
+            <w:r>
+              <w:rPr>
+                <w:b/>
+                <w:bCs/>
+                <w:sz w:val="19"/>
+                <w:szCs w:val="19"/>
+              </w:rPr>
+              <w:t xml:space="preserve">Tryout Umum</w:t>
+            </w:r>
+            <w:r>
+              <w:rPr>
+                <w:sz w:val="19"/>
+                <w:szCs w:val="19"/>
+              </w:rPr>
+              <w:t xml:space="preserve"> adalah tryout yang diatur koordinator (Bu Puspa) untuk banyak kelas — TO Mapel Wajib dan TO Mapel Pilihan — dari halaman Tryout Umum. Keduanya dicatat terpisah, termasuk di Pantau Kurikulum.</w:t>
+            </w:r>
+          </w:p>
+        </w:tc>
+      </w:tr>
+    </w:tbl>
+    <w:p>
+      <w:pPr>
+        <w:spacing w:after="120"/>
+      </w:pPr>
     </w:p>
     <w:p>
       <w:pPr>

</xml_diff>

<commit_message>
Jenis paket Tryout Mandiri / Tryout Umum, label Sasaran TKA/UTBK di jadwal, panduan diperbarui
Co-Authored-By: Claude Opus 5.5 <noreply@anthropic.com>
</commit_message>
<xml_diff>
--- a/Panduan_Guru_Asesmen_Merdeka.docx
+++ b/Panduan_Guru_Asesmen_Merdeka.docx
@@ -3864,7 +3864,39 @@
                 <w:sz w:val="19"/>
                 <w:szCs w:val="19"/>
               </w:rPr>
-              <w:t xml:space="preserve">Pilih salah satu: Asesmen Formatif / Asesmen Sumatif / Tryout ASAS / Tryout TKA / Tryout UTBK. Kosong atau tidak dikenali = </w:t>
+              <w:t xml:space="preserve">Pilih salah satu: Asesmen Formatif / Asesmen Sumatif / </w:t>
+            </w:r>
+            <w:r>
+              <w:rPr>
+                <w:b/>
+                <w:bCs/>
+                <w:sz w:val="19"/>
+                <w:szCs w:val="19"/>
+              </w:rPr>
+              <w:t xml:space="preserve">Tryout Mandiri</w:t>
+            </w:r>
+            <w:r>
+              <w:rPr>
+                <w:sz w:val="19"/>
+                <w:szCs w:val="19"/>
+              </w:rPr>
+              <w:t xml:space="preserve"> (tryout di kelas Anda) / </w:t>
+            </w:r>
+            <w:r>
+              <w:rPr>
+                <w:b/>
+                <w:bCs/>
+                <w:sz w:val="19"/>
+                <w:szCs w:val="19"/>
+              </w:rPr>
+              <w:t xml:space="preserve">Tryout Umum</w:t>
+            </w:r>
+            <w:r>
+              <w:rPr>
+                <w:sz w:val="19"/>
+                <w:szCs w:val="19"/>
+              </w:rPr>
+              <w:t xml:space="preserve"> (soal untuk jadwal koordinator). Kosong atau tidak dikenali = </w:t>
             </w:r>
             <w:r>
               <w:rPr>

</xml_diff>

<commit_message>
Droplist jenis: Asesmen Diagnostik di urutan pertama; panduan guru diperbarui
Co-Authored-By: Claude Opus 5.5 <noreply@anthropic.com>
</commit_message>
<xml_diff>
--- a/Panduan_Guru_Asesmen_Merdeka.docx
+++ b/Panduan_Guru_Asesmen_Merdeka.docx
@@ -3922,7 +3922,23 @@
                 <w:sz w:val="19"/>
                 <w:szCs w:val="19"/>
               </w:rPr>
-              <w:t xml:space="preserve">Pilih salah satu: Asesmen Formatif / Asesmen Sumatif / </w:t>
+              <w:t xml:space="preserve">Pilih salah satu: </w:t>
+            </w:r>
+            <w:r>
+              <w:rPr>
+                <w:b/>
+                <w:bCs/>
+                <w:sz w:val="19"/>
+                <w:szCs w:val="19"/>
+              </w:rPr>
+              <w:t xml:space="preserve">Asesmen Diagnostik</w:t>
+            </w:r>
+            <w:r>
+              <w:rPr>
+                <w:sz w:val="19"/>
+                <w:szCs w:val="19"/>
+              </w:rPr>
+              <w:t xml:space="preserve"> (pemetaan kemampuan awal) / Asesmen Formatif / Asesmen Sumatif / </w:t>
             </w:r>
             <w:r>
               <w:rPr>

</xml_diff>

<commit_message>
Tanpa kisi-kisi: tombol "Siapkan naskah untuk AI"
ChatGPT tidak bisa membaca Equation Word dan menghilangkan subskrip/
superskrip saat membangun ulang berkas. Tombol baru mengubah naskah .docx
sebelum dilampirkan ke AI: Equation -> teks satu baris ((a)/(b), akar,
pangkat), subskrip/superskrip -> karakter Unicode (H2O, 24 derajat C,
dH0f), simbol font Symbol -> Unicode. Prompt dan Panduan Guru diperbarui.

Co-Authored-By: Claude Opus 5.5 <noreply@anthropic.com>
</commit_message>
<xml_diff>
--- a/Panduan_Guru_Asesmen_Merdeka.docx
+++ b/Panduan_Guru_Asesmen_Merdeka.docx
@@ -6803,7 +6803,17 @@
         <w:t xml:space="preserve">Unduh prompt AI / Salin prompt</w:t>
       </w:r>
       <w:r>
-        <w:t xml:space="preserve"> (meminta bantuan ChatGPT/Gemini/Claude). Setiap soal wajib mengisi Bentuk dan Level; aplikasi menyusun kisi-kisi otomatis.</w:t>
+        <w:t xml:space="preserve"> (meminta bantuan ChatGPT/Gemini/Claude). Naskah Word sebaiknya diproses dulu dengan </w:t>
+      </w:r>
+      <w:r>
+        <w:rPr>
+          <w:b/>
+          <w:bCs/>
+        </w:rPr>
+        <w:t xml:space="preserve">Siapkan naskah untuk AI</w:t>
+      </w:r>
+      <w:r>
+        <w:t xml:space="preserve">: rumus Equation, subskrip, dan superskrip diubah menjadi karakter yang tidak hilang saat dibaca AI (H₂O, 24⁰C, (a)/(b)). Lampirkan berkas *…_siap_AI.docx* itu, bukan naskah aslinya. Setiap soal wajib mengisi Bentuk dan Level; aplikasi menyusun kisi-kisi otomatis.</w:t>
       </w:r>
     </w:p>
     <w:p>

</xml_diff>